<commit_message>
Update report: add ethical considerations
</commit_message>
<xml_diff>
--- a/docs/BaoCao_CS117_final.docx
+++ b/docs/BaoCao_CS117_final.docx
@@ -843,7 +843,7 @@
           <w:rFonts w:ascii="Times New Roman" w:hAnsi="Times New Roman" w:cs="Times New Roman"/>
         </w:rPr>
       </w:pPr>
-      <w:bookmarkStart w:id="0" w:name="_Toc230534211"/>
+      <w:bookmarkStart w:id="0" w:name="_Toc230535029"/>
       <w:r>
         <w:rPr>
           <w:rFonts w:ascii="Times New Roman" w:hAnsi="Times New Roman" w:cs="Times New Roman"/>
@@ -890,7 +890,7 @@
           <w:rFonts w:ascii="Times New Roman" w:hAnsi="Times New Roman" w:cs="Times New Roman"/>
         </w:rPr>
       </w:pPr>
-      <w:bookmarkStart w:id="1" w:name="_Toc230534212"/>
+      <w:bookmarkStart w:id="1" w:name="_Toc230535030"/>
       <w:r>
         <w:rPr>
           <w:rFonts w:ascii="Times New Roman" w:hAnsi="Times New Roman" w:cs="Times New Roman"/>
@@ -906,7 +906,12 @@
           <w:tab w:val="right" w:leader="dot" w:pos="9016"/>
         </w:tabs>
         <w:rPr>
+          <w:rFonts w:asciiTheme="minorHAnsi" w:eastAsiaTheme="minorEastAsia" w:hAnsiTheme="minorHAnsi" w:cstheme="minorBidi"/>
           <w:noProof/>
+          <w:kern w:val="2"/>
+          <w:sz w:val="24"/>
+          <w:szCs w:val="30"/>
+          <w14:ligatures w14:val="standardContextual"/>
         </w:rPr>
       </w:pPr>
       <w:r>
@@ -936,7 +941,7 @@
         </w:rPr>
         <w:fldChar w:fldCharType="separate"/>
       </w:r>
-      <w:hyperlink w:anchor="_Toc230534211" w:history="1">
+      <w:hyperlink w:anchor="_Toc230535029" w:history="1">
         <w:r>
           <w:rPr>
             <w:rStyle w:val="Hyperlink"/>
@@ -964,7 +969,7 @@
             <w:noProof/>
             <w:webHidden/>
           </w:rPr>
-          <w:instrText xml:space="preserve"> PAGEREF _Toc230534211 \h </w:instrText>
+          <w:instrText xml:space="preserve"> PAGEREF _Toc230535029 \h </w:instrText>
         </w:r>
         <w:r>
           <w:rPr>
@@ -1002,10 +1007,15 @@
           <w:tab w:val="right" w:leader="dot" w:pos="9016"/>
         </w:tabs>
         <w:rPr>
+          <w:rFonts w:asciiTheme="minorHAnsi" w:eastAsiaTheme="minorEastAsia" w:hAnsiTheme="minorHAnsi" w:cstheme="minorBidi"/>
           <w:noProof/>
-        </w:rPr>
-      </w:pPr>
-      <w:hyperlink w:anchor="_Toc230534212" w:history="1">
+          <w:kern w:val="2"/>
+          <w:sz w:val="24"/>
+          <w:szCs w:val="30"/>
+          <w14:ligatures w14:val="standardContextual"/>
+        </w:rPr>
+      </w:pPr>
+      <w:hyperlink w:anchor="_Toc230535030" w:history="1">
         <w:r>
           <w:rPr>
             <w:rStyle w:val="Hyperlink"/>
@@ -1033,7 +1043,7 @@
             <w:noProof/>
             <w:webHidden/>
           </w:rPr>
-          <w:instrText xml:space="preserve"> PAGEREF _Toc230534212 \h </w:instrText>
+          <w:instrText xml:space="preserve"> PAGEREF _Toc230535030 \h </w:instrText>
         </w:r>
         <w:r>
           <w:rPr>
@@ -1071,10 +1081,15 @@
           <w:tab w:val="right" w:leader="dot" w:pos="9016"/>
         </w:tabs>
         <w:rPr>
+          <w:rFonts w:asciiTheme="minorHAnsi" w:eastAsiaTheme="minorEastAsia" w:hAnsiTheme="minorHAnsi" w:cstheme="minorBidi"/>
           <w:noProof/>
-        </w:rPr>
-      </w:pPr>
-      <w:hyperlink w:anchor="_Toc230534213" w:history="1">
+          <w:kern w:val="2"/>
+          <w:sz w:val="24"/>
+          <w:szCs w:val="30"/>
+          <w14:ligatures w14:val="standardContextual"/>
+        </w:rPr>
+      </w:pPr>
+      <w:hyperlink w:anchor="_Toc230535031" w:history="1">
         <w:r>
           <w:rPr>
             <w:rStyle w:val="Hyperlink"/>
@@ -1102,7 +1117,7 @@
             <w:noProof/>
             <w:webHidden/>
           </w:rPr>
-          <w:instrText xml:space="preserve"> PAGEREF _Toc230534213 \h </w:instrText>
+          <w:instrText xml:space="preserve"> PAGEREF _Toc230535031 \h </w:instrText>
         </w:r>
         <w:r>
           <w:rPr>
@@ -1122,7 +1137,7 @@
             <w:noProof/>
             <w:webHidden/>
           </w:rPr>
-          <w:t>3</w:t>
+          <w:t>4</w:t>
         </w:r>
         <w:r>
           <w:rPr>
@@ -1140,10 +1155,15 @@
           <w:tab w:val="right" w:leader="dot" w:pos="9016"/>
         </w:tabs>
         <w:rPr>
+          <w:rFonts w:asciiTheme="minorHAnsi" w:eastAsiaTheme="minorEastAsia" w:hAnsiTheme="minorHAnsi" w:cstheme="minorBidi"/>
           <w:noProof/>
-        </w:rPr>
-      </w:pPr>
-      <w:hyperlink w:anchor="_Toc230534214" w:history="1">
+          <w:kern w:val="2"/>
+          <w:sz w:val="24"/>
+          <w:szCs w:val="30"/>
+          <w14:ligatures w14:val="standardContextual"/>
+        </w:rPr>
+      </w:pPr>
+      <w:hyperlink w:anchor="_Toc230535032" w:history="1">
         <w:r>
           <w:rPr>
             <w:rStyle w:val="Hyperlink"/>
@@ -1171,7 +1191,7 @@
             <w:noProof/>
             <w:webHidden/>
           </w:rPr>
-          <w:instrText xml:space="preserve"> PAGEREF _Toc230534214 \h </w:instrText>
+          <w:instrText xml:space="preserve"> PAGEREF _Toc230535032 \h </w:instrText>
         </w:r>
         <w:r>
           <w:rPr>
@@ -1191,7 +1211,7 @@
             <w:noProof/>
             <w:webHidden/>
           </w:rPr>
-          <w:t>3</w:t>
+          <w:t>4</w:t>
         </w:r>
         <w:r>
           <w:rPr>
@@ -1209,10 +1229,15 @@
           <w:tab w:val="right" w:leader="dot" w:pos="9016"/>
         </w:tabs>
         <w:rPr>
+          <w:rFonts w:asciiTheme="minorHAnsi" w:eastAsiaTheme="minorEastAsia" w:hAnsiTheme="minorHAnsi" w:cstheme="minorBidi"/>
           <w:noProof/>
-        </w:rPr>
-      </w:pPr>
-      <w:hyperlink w:anchor="_Toc230534215" w:history="1">
+          <w:kern w:val="2"/>
+          <w:sz w:val="24"/>
+          <w:szCs w:val="30"/>
+          <w14:ligatures w14:val="standardContextual"/>
+        </w:rPr>
+      </w:pPr>
+      <w:hyperlink w:anchor="_Toc230535033" w:history="1">
         <w:r>
           <w:rPr>
             <w:rStyle w:val="Hyperlink"/>
@@ -1240,7 +1265,7 @@
             <w:noProof/>
             <w:webHidden/>
           </w:rPr>
-          <w:instrText xml:space="preserve"> PAGEREF _Toc230534215 \h </w:instrText>
+          <w:instrText xml:space="preserve"> PAGEREF _Toc230535033 \h </w:instrText>
         </w:r>
         <w:r>
           <w:rPr>
@@ -1260,7 +1285,7 @@
             <w:noProof/>
             <w:webHidden/>
           </w:rPr>
-          <w:t>3</w:t>
+          <w:t>4</w:t>
         </w:r>
         <w:r>
           <w:rPr>
@@ -1278,10 +1303,15 @@
           <w:tab w:val="right" w:leader="dot" w:pos="9016"/>
         </w:tabs>
         <w:rPr>
+          <w:rFonts w:asciiTheme="minorHAnsi" w:eastAsiaTheme="minorEastAsia" w:hAnsiTheme="minorHAnsi" w:cstheme="minorBidi"/>
           <w:noProof/>
-        </w:rPr>
-      </w:pPr>
-      <w:hyperlink w:anchor="_Toc230534216" w:history="1">
+          <w:kern w:val="2"/>
+          <w:sz w:val="24"/>
+          <w:szCs w:val="30"/>
+          <w14:ligatures w14:val="standardContextual"/>
+        </w:rPr>
+      </w:pPr>
+      <w:hyperlink w:anchor="_Toc230535034" w:history="1">
         <w:r>
           <w:rPr>
             <w:rStyle w:val="Hyperlink"/>
@@ -1309,7 +1339,7 @@
             <w:noProof/>
             <w:webHidden/>
           </w:rPr>
-          <w:instrText xml:space="preserve"> PAGEREF _Toc230534216 \h </w:instrText>
+          <w:instrText xml:space="preserve"> PAGEREF _Toc230535034 \h </w:instrText>
         </w:r>
         <w:r>
           <w:rPr>
@@ -1329,7 +1359,7 @@
             <w:noProof/>
             <w:webHidden/>
           </w:rPr>
-          <w:t>3</w:t>
+          <w:t>4</w:t>
         </w:r>
         <w:r>
           <w:rPr>
@@ -1347,10 +1377,15 @@
           <w:tab w:val="right" w:leader="dot" w:pos="9016"/>
         </w:tabs>
         <w:rPr>
+          <w:rFonts w:asciiTheme="minorHAnsi" w:eastAsiaTheme="minorEastAsia" w:hAnsiTheme="minorHAnsi" w:cstheme="minorBidi"/>
           <w:noProof/>
-        </w:rPr>
-      </w:pPr>
-      <w:hyperlink w:anchor="_Toc230534217" w:history="1">
+          <w:kern w:val="2"/>
+          <w:sz w:val="24"/>
+          <w:szCs w:val="30"/>
+          <w14:ligatures w14:val="standardContextual"/>
+        </w:rPr>
+      </w:pPr>
+      <w:hyperlink w:anchor="_Toc230535035" w:history="1">
         <w:r>
           <w:rPr>
             <w:rStyle w:val="Hyperlink"/>
@@ -1378,7 +1413,7 @@
             <w:noProof/>
             <w:webHidden/>
           </w:rPr>
-          <w:instrText xml:space="preserve"> PAGEREF _Toc230534217 \h </w:instrText>
+          <w:instrText xml:space="preserve"> PAGEREF _Toc230535035 \h </w:instrText>
         </w:r>
         <w:r>
           <w:rPr>
@@ -1416,10 +1451,15 @@
           <w:tab w:val="right" w:leader="dot" w:pos="9016"/>
         </w:tabs>
         <w:rPr>
+          <w:rFonts w:asciiTheme="minorHAnsi" w:eastAsiaTheme="minorEastAsia" w:hAnsiTheme="minorHAnsi" w:cstheme="minorBidi"/>
           <w:noProof/>
-        </w:rPr>
-      </w:pPr>
-      <w:hyperlink w:anchor="_Toc230534218" w:history="1">
+          <w:kern w:val="2"/>
+          <w:sz w:val="24"/>
+          <w:szCs w:val="30"/>
+          <w14:ligatures w14:val="standardContextual"/>
+        </w:rPr>
+      </w:pPr>
+      <w:hyperlink w:anchor="_Toc230535036" w:history="1">
         <w:r>
           <w:rPr>
             <w:rStyle w:val="Hyperlink"/>
@@ -1447,7 +1487,7 @@
             <w:noProof/>
             <w:webHidden/>
           </w:rPr>
-          <w:instrText xml:space="preserve"> PAGEREF _Toc230534218 \h </w:instrText>
+          <w:instrText xml:space="preserve"> PAGEREF _Toc230535036 \h </w:instrText>
         </w:r>
         <w:r>
           <w:rPr>
@@ -1467,7 +1507,7 @@
             <w:noProof/>
             <w:webHidden/>
           </w:rPr>
-          <w:t>4</w:t>
+          <w:t>5</w:t>
         </w:r>
         <w:r>
           <w:rPr>
@@ -1485,10 +1525,15 @@
           <w:tab w:val="right" w:leader="dot" w:pos="9016"/>
         </w:tabs>
         <w:rPr>
+          <w:rFonts w:asciiTheme="minorHAnsi" w:eastAsiaTheme="minorEastAsia" w:hAnsiTheme="minorHAnsi" w:cstheme="minorBidi"/>
           <w:noProof/>
-        </w:rPr>
-      </w:pPr>
-      <w:hyperlink w:anchor="_Toc230534219" w:history="1">
+          <w:kern w:val="2"/>
+          <w:sz w:val="24"/>
+          <w:szCs w:val="30"/>
+          <w14:ligatures w14:val="standardContextual"/>
+        </w:rPr>
+      </w:pPr>
+      <w:hyperlink w:anchor="_Toc230535037" w:history="1">
         <w:r>
           <w:rPr>
             <w:rStyle w:val="Hyperlink"/>
@@ -1516,7 +1561,7 @@
             <w:noProof/>
             <w:webHidden/>
           </w:rPr>
-          <w:instrText xml:space="preserve"> PAGEREF _Toc230534219 \h </w:instrText>
+          <w:instrText xml:space="preserve"> PAGEREF _Toc230535037 \h </w:instrText>
         </w:r>
         <w:r>
           <w:rPr>
@@ -1554,10 +1599,15 @@
           <w:tab w:val="right" w:leader="dot" w:pos="9016"/>
         </w:tabs>
         <w:rPr>
+          <w:rFonts w:asciiTheme="minorHAnsi" w:eastAsiaTheme="minorEastAsia" w:hAnsiTheme="minorHAnsi" w:cstheme="minorBidi"/>
           <w:noProof/>
-        </w:rPr>
-      </w:pPr>
-      <w:hyperlink w:anchor="_Toc230534220" w:history="1">
+          <w:kern w:val="2"/>
+          <w:sz w:val="24"/>
+          <w:szCs w:val="30"/>
+          <w14:ligatures w14:val="standardContextual"/>
+        </w:rPr>
+      </w:pPr>
+      <w:hyperlink w:anchor="_Toc230535038" w:history="1">
         <w:r>
           <w:rPr>
             <w:rStyle w:val="Hyperlink"/>
@@ -1585,7 +1635,7 @@
             <w:noProof/>
             <w:webHidden/>
           </w:rPr>
-          <w:instrText xml:space="preserve"> PAGEREF _Toc230534220 \h </w:instrText>
+          <w:instrText xml:space="preserve"> PAGEREF _Toc230535038 \h </w:instrText>
         </w:r>
         <w:r>
           <w:rPr>
@@ -1605,7 +1655,7 @@
             <w:noProof/>
             <w:webHidden/>
           </w:rPr>
-          <w:t>5</w:t>
+          <w:t>6</w:t>
         </w:r>
         <w:r>
           <w:rPr>
@@ -1623,10 +1673,15 @@
           <w:tab w:val="right" w:leader="dot" w:pos="9016"/>
         </w:tabs>
         <w:rPr>
+          <w:rFonts w:asciiTheme="minorHAnsi" w:eastAsiaTheme="minorEastAsia" w:hAnsiTheme="minorHAnsi" w:cstheme="minorBidi"/>
           <w:noProof/>
-        </w:rPr>
-      </w:pPr>
-      <w:hyperlink w:anchor="_Toc230534221" w:history="1">
+          <w:kern w:val="2"/>
+          <w:sz w:val="24"/>
+          <w:szCs w:val="30"/>
+          <w14:ligatures w14:val="standardContextual"/>
+        </w:rPr>
+      </w:pPr>
+      <w:hyperlink w:anchor="_Toc230535039" w:history="1">
         <w:r>
           <w:rPr>
             <w:rStyle w:val="Hyperlink"/>
@@ -1654,7 +1709,7 @@
             <w:noProof/>
             <w:webHidden/>
           </w:rPr>
-          <w:instrText xml:space="preserve"> PAGEREF _Toc230534221 \h </w:instrText>
+          <w:instrText xml:space="preserve"> PAGEREF _Toc230535039 \h </w:instrText>
         </w:r>
         <w:r>
           <w:rPr>
@@ -1674,7 +1729,81 @@
             <w:noProof/>
             <w:webHidden/>
           </w:rPr>
-          <w:t>5</w:t>
+          <w:t>6</w:t>
+        </w:r>
+        <w:r>
+          <w:rPr>
+            <w:noProof/>
+            <w:webHidden/>
+          </w:rPr>
+          <w:fldChar w:fldCharType="end"/>
+        </w:r>
+      </w:hyperlink>
+    </w:p>
+    <w:p>
+      <w:pPr>
+        <w:pStyle w:val="TOC2"/>
+        <w:tabs>
+          <w:tab w:val="right" w:leader="dot" w:pos="9016"/>
+        </w:tabs>
+        <w:rPr>
+          <w:rFonts w:asciiTheme="minorHAnsi" w:eastAsiaTheme="minorEastAsia" w:hAnsiTheme="minorHAnsi" w:cstheme="minorBidi"/>
+          <w:noProof/>
+          <w:kern w:val="2"/>
+          <w:sz w:val="24"/>
+          <w:szCs w:val="30"/>
+          <w14:ligatures w14:val="standardContextual"/>
+        </w:rPr>
+      </w:pPr>
+      <w:hyperlink w:anchor="_Toc230535040" w:history="1">
+        <w:r>
+          <w:rPr>
+            <w:rStyle w:val="Hyperlink"/>
+            <w:rFonts w:ascii="Times New Roman" w:hAnsi="Times New Roman" w:cs="Times New Roman"/>
+            <w:noProof/>
+          </w:rPr>
+          <w:t>1.3. Cân nhắc đạo đức (Ethical Considerations)</w:t>
+        </w:r>
+        <w:r>
+          <w:rPr>
+            <w:noProof/>
+            <w:webHidden/>
+          </w:rPr>
+          <w:tab/>
+        </w:r>
+        <w:r>
+          <w:rPr>
+            <w:noProof/>
+            <w:webHidden/>
+          </w:rPr>
+          <w:fldChar w:fldCharType="begin"/>
+        </w:r>
+        <w:r>
+          <w:rPr>
+            <w:noProof/>
+            <w:webHidden/>
+          </w:rPr>
+          <w:instrText xml:space="preserve"> PAGEREF _Toc230535040 \h </w:instrText>
+        </w:r>
+        <w:r>
+          <w:rPr>
+            <w:noProof/>
+            <w:webHidden/>
+          </w:rPr>
+        </w:r>
+        <w:r>
+          <w:rPr>
+            <w:noProof/>
+            <w:webHidden/>
+          </w:rPr>
+          <w:fldChar w:fldCharType="separate"/>
+        </w:r>
+        <w:r>
+          <w:rPr>
+            <w:noProof/>
+            <w:webHidden/>
+          </w:rPr>
+          <w:t>6</w:t>
         </w:r>
         <w:r>
           <w:rPr>
@@ -1692,10 +1821,15 @@
           <w:tab w:val="right" w:leader="dot" w:pos="9016"/>
         </w:tabs>
         <w:rPr>
+          <w:rFonts w:asciiTheme="minorHAnsi" w:eastAsiaTheme="minorEastAsia" w:hAnsiTheme="minorHAnsi" w:cstheme="minorBidi"/>
           <w:noProof/>
-        </w:rPr>
-      </w:pPr>
-      <w:hyperlink w:anchor="_Toc230534222" w:history="1">
+          <w:kern w:val="2"/>
+          <w:sz w:val="24"/>
+          <w:szCs w:val="30"/>
+          <w14:ligatures w14:val="standardContextual"/>
+        </w:rPr>
+      </w:pPr>
+      <w:hyperlink w:anchor="_Toc230535041" w:history="1">
         <w:r>
           <w:rPr>
             <w:rStyle w:val="Hyperlink"/>
@@ -1723,7 +1857,7 @@
             <w:noProof/>
             <w:webHidden/>
           </w:rPr>
-          <w:instrText xml:space="preserve"> PAGEREF _Toc230534222 \h </w:instrText>
+          <w:instrText xml:space="preserve"> PAGEREF _Toc230535041 \h </w:instrText>
         </w:r>
         <w:r>
           <w:rPr>
@@ -1743,7 +1877,7 @@
             <w:noProof/>
             <w:webHidden/>
           </w:rPr>
-          <w:t>6</w:t>
+          <w:t>7</w:t>
         </w:r>
         <w:r>
           <w:rPr>
@@ -1761,10 +1895,15 @@
           <w:tab w:val="right" w:leader="dot" w:pos="9016"/>
         </w:tabs>
         <w:rPr>
+          <w:rFonts w:asciiTheme="minorHAnsi" w:eastAsiaTheme="minorEastAsia" w:hAnsiTheme="minorHAnsi" w:cstheme="minorBidi"/>
           <w:noProof/>
-        </w:rPr>
-      </w:pPr>
-      <w:hyperlink w:anchor="_Toc230534223" w:history="1">
+          <w:kern w:val="2"/>
+          <w:sz w:val="24"/>
+          <w:szCs w:val="30"/>
+          <w14:ligatures w14:val="standardContextual"/>
+        </w:rPr>
+      </w:pPr>
+      <w:hyperlink w:anchor="_Toc230535042" w:history="1">
         <w:r>
           <w:rPr>
             <w:rStyle w:val="Hyperlink"/>
@@ -1792,7 +1931,7 @@
             <w:noProof/>
             <w:webHidden/>
           </w:rPr>
-          <w:instrText xml:space="preserve"> PAGEREF _Toc230534223 \h </w:instrText>
+          <w:instrText xml:space="preserve"> PAGEREF _Toc230535042 \h </w:instrText>
         </w:r>
         <w:r>
           <w:rPr>
@@ -1812,7 +1951,7 @@
             <w:noProof/>
             <w:webHidden/>
           </w:rPr>
-          <w:t>6</w:t>
+          <w:t>7</w:t>
         </w:r>
         <w:r>
           <w:rPr>
@@ -1830,10 +1969,15 @@
           <w:tab w:val="right" w:leader="dot" w:pos="9016"/>
         </w:tabs>
         <w:rPr>
+          <w:rFonts w:asciiTheme="minorHAnsi" w:eastAsiaTheme="minorEastAsia" w:hAnsiTheme="minorHAnsi" w:cstheme="minorBidi"/>
           <w:noProof/>
-        </w:rPr>
-      </w:pPr>
-      <w:hyperlink w:anchor="_Toc230534224" w:history="1">
+          <w:kern w:val="2"/>
+          <w:sz w:val="24"/>
+          <w:szCs w:val="30"/>
+          <w14:ligatures w14:val="standardContextual"/>
+        </w:rPr>
+      </w:pPr>
+      <w:hyperlink w:anchor="_Toc230535043" w:history="1">
         <w:r>
           <w:rPr>
             <w:rStyle w:val="Hyperlink"/>
@@ -1861,7 +2005,7 @@
             <w:noProof/>
             <w:webHidden/>
           </w:rPr>
-          <w:instrText xml:space="preserve"> PAGEREF _Toc230534224 \h </w:instrText>
+          <w:instrText xml:space="preserve"> PAGEREF _Toc230535043 \h </w:instrText>
         </w:r>
         <w:r>
           <w:rPr>
@@ -1881,7 +2025,7 @@
             <w:noProof/>
             <w:webHidden/>
           </w:rPr>
-          <w:t>6</w:t>
+          <w:t>7</w:t>
         </w:r>
         <w:r>
           <w:rPr>
@@ -1899,10 +2043,15 @@
           <w:tab w:val="right" w:leader="dot" w:pos="9016"/>
         </w:tabs>
         <w:rPr>
+          <w:rFonts w:asciiTheme="minorHAnsi" w:eastAsiaTheme="minorEastAsia" w:hAnsiTheme="minorHAnsi" w:cstheme="minorBidi"/>
           <w:noProof/>
-        </w:rPr>
-      </w:pPr>
-      <w:hyperlink w:anchor="_Toc230534225" w:history="1">
+          <w:kern w:val="2"/>
+          <w:sz w:val="24"/>
+          <w:szCs w:val="30"/>
+          <w14:ligatures w14:val="standardContextual"/>
+        </w:rPr>
+      </w:pPr>
+      <w:hyperlink w:anchor="_Toc230535044" w:history="1">
         <w:r>
           <w:rPr>
             <w:rStyle w:val="Hyperlink"/>
@@ -1930,7 +2079,7 @@
             <w:noProof/>
             <w:webHidden/>
           </w:rPr>
-          <w:instrText xml:space="preserve"> PAGEREF _Toc230534225 \h </w:instrText>
+          <w:instrText xml:space="preserve"> PAGEREF _Toc230535044 \h </w:instrText>
         </w:r>
         <w:r>
           <w:rPr>
@@ -1950,7 +2099,7 @@
             <w:noProof/>
             <w:webHidden/>
           </w:rPr>
-          <w:t>6</w:t>
+          <w:t>7</w:t>
         </w:r>
         <w:r>
           <w:rPr>
@@ -1968,10 +2117,15 @@
           <w:tab w:val="right" w:leader="dot" w:pos="9016"/>
         </w:tabs>
         <w:rPr>
+          <w:rFonts w:asciiTheme="minorHAnsi" w:eastAsiaTheme="minorEastAsia" w:hAnsiTheme="minorHAnsi" w:cstheme="minorBidi"/>
           <w:noProof/>
-        </w:rPr>
-      </w:pPr>
-      <w:hyperlink w:anchor="_Toc230534226" w:history="1">
+          <w:kern w:val="2"/>
+          <w:sz w:val="24"/>
+          <w:szCs w:val="30"/>
+          <w14:ligatures w14:val="standardContextual"/>
+        </w:rPr>
+      </w:pPr>
+      <w:hyperlink w:anchor="_Toc230535045" w:history="1">
         <w:r>
           <w:rPr>
             <w:rStyle w:val="Hyperlink"/>
@@ -1999,7 +2153,7 @@
             <w:noProof/>
             <w:webHidden/>
           </w:rPr>
-          <w:instrText xml:space="preserve"> PAGEREF _Toc230534226 \h </w:instrText>
+          <w:instrText xml:space="preserve"> PAGEREF _Toc230535045 \h </w:instrText>
         </w:r>
         <w:r>
           <w:rPr>
@@ -2019,7 +2173,7 @@
             <w:noProof/>
             <w:webHidden/>
           </w:rPr>
-          <w:t>7</w:t>
+          <w:t>8</w:t>
         </w:r>
         <w:r>
           <w:rPr>
@@ -2037,10 +2191,15 @@
           <w:tab w:val="right" w:leader="dot" w:pos="9016"/>
         </w:tabs>
         <w:rPr>
+          <w:rFonts w:asciiTheme="minorHAnsi" w:eastAsiaTheme="minorEastAsia" w:hAnsiTheme="minorHAnsi" w:cstheme="minorBidi"/>
           <w:noProof/>
-        </w:rPr>
-      </w:pPr>
-      <w:hyperlink w:anchor="_Toc230534227" w:history="1">
+          <w:kern w:val="2"/>
+          <w:sz w:val="24"/>
+          <w:szCs w:val="30"/>
+          <w14:ligatures w14:val="standardContextual"/>
+        </w:rPr>
+      </w:pPr>
+      <w:hyperlink w:anchor="_Toc230535046" w:history="1">
         <w:r>
           <w:rPr>
             <w:rStyle w:val="Hyperlink"/>
@@ -2068,7 +2227,7 @@
             <w:noProof/>
             <w:webHidden/>
           </w:rPr>
-          <w:instrText xml:space="preserve"> PAGEREF _Toc230534227 \h </w:instrText>
+          <w:instrText xml:space="preserve"> PAGEREF _Toc230535046 \h </w:instrText>
         </w:r>
         <w:r>
           <w:rPr>
@@ -2088,7 +2247,7 @@
             <w:noProof/>
             <w:webHidden/>
           </w:rPr>
-          <w:t>8</w:t>
+          <w:t>9</w:t>
         </w:r>
         <w:r>
           <w:rPr>
@@ -2106,10 +2265,15 @@
           <w:tab w:val="right" w:leader="dot" w:pos="9016"/>
         </w:tabs>
         <w:rPr>
+          <w:rFonts w:asciiTheme="minorHAnsi" w:eastAsiaTheme="minorEastAsia" w:hAnsiTheme="minorHAnsi" w:cstheme="minorBidi"/>
           <w:noProof/>
-        </w:rPr>
-      </w:pPr>
-      <w:hyperlink w:anchor="_Toc230534228" w:history="1">
+          <w:kern w:val="2"/>
+          <w:sz w:val="24"/>
+          <w:szCs w:val="30"/>
+          <w14:ligatures w14:val="standardContextual"/>
+        </w:rPr>
+      </w:pPr>
+      <w:hyperlink w:anchor="_Toc230535047" w:history="1">
         <w:r>
           <w:rPr>
             <w:rStyle w:val="Hyperlink"/>
@@ -2137,7 +2301,7 @@
             <w:noProof/>
             <w:webHidden/>
           </w:rPr>
-          <w:instrText xml:space="preserve"> PAGEREF _Toc230534228 \h </w:instrText>
+          <w:instrText xml:space="preserve"> PAGEREF _Toc230535047 \h </w:instrText>
         </w:r>
         <w:r>
           <w:rPr>
@@ -2157,7 +2321,7 @@
             <w:noProof/>
             <w:webHidden/>
           </w:rPr>
-          <w:t>8</w:t>
+          <w:t>9</w:t>
         </w:r>
         <w:r>
           <w:rPr>
@@ -2175,10 +2339,15 @@
           <w:tab w:val="right" w:leader="dot" w:pos="9016"/>
         </w:tabs>
         <w:rPr>
+          <w:rFonts w:asciiTheme="minorHAnsi" w:eastAsiaTheme="minorEastAsia" w:hAnsiTheme="minorHAnsi" w:cstheme="minorBidi"/>
           <w:noProof/>
-        </w:rPr>
-      </w:pPr>
-      <w:hyperlink w:anchor="_Toc230534229" w:history="1">
+          <w:kern w:val="2"/>
+          <w:sz w:val="24"/>
+          <w:szCs w:val="30"/>
+          <w14:ligatures w14:val="standardContextual"/>
+        </w:rPr>
+      </w:pPr>
+      <w:hyperlink w:anchor="_Toc230535048" w:history="1">
         <w:r>
           <w:rPr>
             <w:rStyle w:val="Hyperlink"/>
@@ -2206,7 +2375,7 @@
             <w:noProof/>
             <w:webHidden/>
           </w:rPr>
-          <w:instrText xml:space="preserve"> PAGEREF _Toc230534229 \h </w:instrText>
+          <w:instrText xml:space="preserve"> PAGEREF _Toc230535048 \h </w:instrText>
         </w:r>
         <w:r>
           <w:rPr>
@@ -2226,7 +2395,7 @@
             <w:noProof/>
             <w:webHidden/>
           </w:rPr>
-          <w:t>8</w:t>
+          <w:t>9</w:t>
         </w:r>
         <w:r>
           <w:rPr>
@@ -2244,10 +2413,15 @@
           <w:tab w:val="right" w:leader="dot" w:pos="9016"/>
         </w:tabs>
         <w:rPr>
+          <w:rFonts w:asciiTheme="minorHAnsi" w:eastAsiaTheme="minorEastAsia" w:hAnsiTheme="minorHAnsi" w:cstheme="minorBidi"/>
           <w:noProof/>
-        </w:rPr>
-      </w:pPr>
-      <w:hyperlink w:anchor="_Toc230534230" w:history="1">
+          <w:kern w:val="2"/>
+          <w:sz w:val="24"/>
+          <w:szCs w:val="30"/>
+          <w14:ligatures w14:val="standardContextual"/>
+        </w:rPr>
+      </w:pPr>
+      <w:hyperlink w:anchor="_Toc230535049" w:history="1">
         <w:r>
           <w:rPr>
             <w:rStyle w:val="Hyperlink"/>
@@ -2275,7 +2449,7 @@
             <w:noProof/>
             <w:webHidden/>
           </w:rPr>
-          <w:instrText xml:space="preserve"> PAGEREF _Toc230534230 \h </w:instrText>
+          <w:instrText xml:space="preserve"> PAGEREF _Toc230535049 \h </w:instrText>
         </w:r>
         <w:r>
           <w:rPr>
@@ -2295,7 +2469,7 @@
             <w:noProof/>
             <w:webHidden/>
           </w:rPr>
-          <w:t>8</w:t>
+          <w:t>9</w:t>
         </w:r>
         <w:r>
           <w:rPr>
@@ -2313,10 +2487,15 @@
           <w:tab w:val="right" w:leader="dot" w:pos="9016"/>
         </w:tabs>
         <w:rPr>
+          <w:rFonts w:asciiTheme="minorHAnsi" w:eastAsiaTheme="minorEastAsia" w:hAnsiTheme="minorHAnsi" w:cstheme="minorBidi"/>
           <w:noProof/>
-        </w:rPr>
-      </w:pPr>
-      <w:hyperlink w:anchor="_Toc230534231" w:history="1">
+          <w:kern w:val="2"/>
+          <w:sz w:val="24"/>
+          <w:szCs w:val="30"/>
+          <w14:ligatures w14:val="standardContextual"/>
+        </w:rPr>
+      </w:pPr>
+      <w:hyperlink w:anchor="_Toc230535050" w:history="1">
         <w:r>
           <w:rPr>
             <w:rStyle w:val="Hyperlink"/>
@@ -2344,7 +2523,7 @@
             <w:noProof/>
             <w:webHidden/>
           </w:rPr>
-          <w:instrText xml:space="preserve"> PAGEREF _Toc230534231 \h </w:instrText>
+          <w:instrText xml:space="preserve"> PAGEREF _Toc230535050 \h </w:instrText>
         </w:r>
         <w:r>
           <w:rPr>
@@ -2364,7 +2543,7 @@
             <w:noProof/>
             <w:webHidden/>
           </w:rPr>
-          <w:t>8</w:t>
+          <w:t>9</w:t>
         </w:r>
         <w:r>
           <w:rPr>
@@ -2382,10 +2561,15 @@
           <w:tab w:val="right" w:leader="dot" w:pos="9016"/>
         </w:tabs>
         <w:rPr>
+          <w:rFonts w:asciiTheme="minorHAnsi" w:eastAsiaTheme="minorEastAsia" w:hAnsiTheme="minorHAnsi" w:cstheme="minorBidi"/>
           <w:noProof/>
-        </w:rPr>
-      </w:pPr>
-      <w:hyperlink w:anchor="_Toc230534232" w:history="1">
+          <w:kern w:val="2"/>
+          <w:sz w:val="24"/>
+          <w:szCs w:val="30"/>
+          <w14:ligatures w14:val="standardContextual"/>
+        </w:rPr>
+      </w:pPr>
+      <w:hyperlink w:anchor="_Toc230535051" w:history="1">
         <w:r>
           <w:rPr>
             <w:rStyle w:val="Hyperlink"/>
@@ -2413,7 +2597,7 @@
             <w:noProof/>
             <w:webHidden/>
           </w:rPr>
-          <w:instrText xml:space="preserve"> PAGEREF _Toc230534232 \h </w:instrText>
+          <w:instrText xml:space="preserve"> PAGEREF _Toc230535051 \h </w:instrText>
         </w:r>
         <w:r>
           <w:rPr>
@@ -2433,7 +2617,7 @@
             <w:noProof/>
             <w:webHidden/>
           </w:rPr>
-          <w:t>9</w:t>
+          <w:t>10</w:t>
         </w:r>
         <w:r>
           <w:rPr>
@@ -2451,10 +2635,15 @@
           <w:tab w:val="right" w:leader="dot" w:pos="9016"/>
         </w:tabs>
         <w:rPr>
+          <w:rFonts w:asciiTheme="minorHAnsi" w:eastAsiaTheme="minorEastAsia" w:hAnsiTheme="minorHAnsi" w:cstheme="minorBidi"/>
           <w:noProof/>
-        </w:rPr>
-      </w:pPr>
-      <w:hyperlink w:anchor="_Toc230534233" w:history="1">
+          <w:kern w:val="2"/>
+          <w:sz w:val="24"/>
+          <w:szCs w:val="30"/>
+          <w14:ligatures w14:val="standardContextual"/>
+        </w:rPr>
+      </w:pPr>
+      <w:hyperlink w:anchor="_Toc230535052" w:history="1">
         <w:r>
           <w:rPr>
             <w:rStyle w:val="Hyperlink"/>
@@ -2482,7 +2671,7 @@
             <w:noProof/>
             <w:webHidden/>
           </w:rPr>
-          <w:instrText xml:space="preserve"> PAGEREF _Toc230534233 \h </w:instrText>
+          <w:instrText xml:space="preserve"> PAGEREF _Toc230535052 \h </w:instrText>
         </w:r>
         <w:r>
           <w:rPr>
@@ -2502,7 +2691,7 @@
             <w:noProof/>
             <w:webHidden/>
           </w:rPr>
-          <w:t>9</w:t>
+          <w:t>10</w:t>
         </w:r>
         <w:r>
           <w:rPr>
@@ -2520,10 +2709,15 @@
           <w:tab w:val="right" w:leader="dot" w:pos="9016"/>
         </w:tabs>
         <w:rPr>
+          <w:rFonts w:asciiTheme="minorHAnsi" w:eastAsiaTheme="minorEastAsia" w:hAnsiTheme="minorHAnsi" w:cstheme="minorBidi"/>
           <w:noProof/>
-        </w:rPr>
-      </w:pPr>
-      <w:hyperlink w:anchor="_Toc230534234" w:history="1">
+          <w:kern w:val="2"/>
+          <w:sz w:val="24"/>
+          <w:szCs w:val="30"/>
+          <w14:ligatures w14:val="standardContextual"/>
+        </w:rPr>
+      </w:pPr>
+      <w:hyperlink w:anchor="_Toc230535053" w:history="1">
         <w:r>
           <w:rPr>
             <w:rStyle w:val="Hyperlink"/>
@@ -2551,7 +2745,7 @@
             <w:noProof/>
             <w:webHidden/>
           </w:rPr>
-          <w:instrText xml:space="preserve"> PAGEREF _Toc230534234 \h </w:instrText>
+          <w:instrText xml:space="preserve"> PAGEREF _Toc230535053 \h </w:instrText>
         </w:r>
         <w:r>
           <w:rPr>
@@ -2571,7 +2765,7 @@
             <w:noProof/>
             <w:webHidden/>
           </w:rPr>
-          <w:t>9</w:t>
+          <w:t>10</w:t>
         </w:r>
         <w:r>
           <w:rPr>
@@ -2589,10 +2783,15 @@
           <w:tab w:val="right" w:leader="dot" w:pos="9016"/>
         </w:tabs>
         <w:rPr>
+          <w:rFonts w:asciiTheme="minorHAnsi" w:eastAsiaTheme="minorEastAsia" w:hAnsiTheme="minorHAnsi" w:cstheme="minorBidi"/>
           <w:noProof/>
-        </w:rPr>
-      </w:pPr>
-      <w:hyperlink w:anchor="_Toc230534235" w:history="1">
+          <w:kern w:val="2"/>
+          <w:sz w:val="24"/>
+          <w:szCs w:val="30"/>
+          <w14:ligatures w14:val="standardContextual"/>
+        </w:rPr>
+      </w:pPr>
+      <w:hyperlink w:anchor="_Toc230535054" w:history="1">
         <w:r>
           <w:rPr>
             <w:rStyle w:val="Hyperlink"/>
@@ -2620,7 +2819,7 @@
             <w:noProof/>
             <w:webHidden/>
           </w:rPr>
-          <w:instrText xml:space="preserve"> PAGEREF _Toc230534235 \h </w:instrText>
+          <w:instrText xml:space="preserve"> PAGEREF _Toc230535054 \h </w:instrText>
         </w:r>
         <w:r>
           <w:rPr>
@@ -2640,7 +2839,7 @@
             <w:noProof/>
             <w:webHidden/>
           </w:rPr>
-          <w:t>10</w:t>
+          <w:t>11</w:t>
         </w:r>
         <w:r>
           <w:rPr>
@@ -2658,10 +2857,15 @@
           <w:tab w:val="right" w:leader="dot" w:pos="9016"/>
         </w:tabs>
         <w:rPr>
+          <w:rFonts w:asciiTheme="minorHAnsi" w:eastAsiaTheme="minorEastAsia" w:hAnsiTheme="minorHAnsi" w:cstheme="minorBidi"/>
           <w:noProof/>
-        </w:rPr>
-      </w:pPr>
-      <w:hyperlink w:anchor="_Toc230534236" w:history="1">
+          <w:kern w:val="2"/>
+          <w:sz w:val="24"/>
+          <w:szCs w:val="30"/>
+          <w14:ligatures w14:val="standardContextual"/>
+        </w:rPr>
+      </w:pPr>
+      <w:hyperlink w:anchor="_Toc230535055" w:history="1">
         <w:r>
           <w:rPr>
             <w:rStyle w:val="Hyperlink"/>
@@ -2689,7 +2893,7 @@
             <w:noProof/>
             <w:webHidden/>
           </w:rPr>
-          <w:instrText xml:space="preserve"> PAGEREF _Toc230534236 \h </w:instrText>
+          <w:instrText xml:space="preserve"> PAGEREF _Toc230535055 \h </w:instrText>
         </w:r>
         <w:r>
           <w:rPr>
@@ -2709,7 +2913,7 @@
             <w:noProof/>
             <w:webHidden/>
           </w:rPr>
-          <w:t>11</w:t>
+          <w:t>12</w:t>
         </w:r>
         <w:r>
           <w:rPr>
@@ -2727,10 +2931,15 @@
           <w:tab w:val="right" w:leader="dot" w:pos="9016"/>
         </w:tabs>
         <w:rPr>
+          <w:rFonts w:asciiTheme="minorHAnsi" w:eastAsiaTheme="minorEastAsia" w:hAnsiTheme="minorHAnsi" w:cstheme="minorBidi"/>
           <w:noProof/>
-        </w:rPr>
-      </w:pPr>
-      <w:hyperlink w:anchor="_Toc230534237" w:history="1">
+          <w:kern w:val="2"/>
+          <w:sz w:val="24"/>
+          <w:szCs w:val="30"/>
+          <w14:ligatures w14:val="standardContextual"/>
+        </w:rPr>
+      </w:pPr>
+      <w:hyperlink w:anchor="_Toc230535056" w:history="1">
         <w:r>
           <w:rPr>
             <w:rStyle w:val="Hyperlink"/>
@@ -2758,7 +2967,7 @@
             <w:noProof/>
             <w:webHidden/>
           </w:rPr>
-          <w:instrText xml:space="preserve"> PAGEREF _Toc230534237 \h </w:instrText>
+          <w:instrText xml:space="preserve"> PAGEREF _Toc230535056 \h </w:instrText>
         </w:r>
         <w:r>
           <w:rPr>
@@ -2778,7 +2987,7 @@
             <w:noProof/>
             <w:webHidden/>
           </w:rPr>
-          <w:t>11</w:t>
+          <w:t>12</w:t>
         </w:r>
         <w:r>
           <w:rPr>
@@ -2796,10 +3005,15 @@
           <w:tab w:val="right" w:leader="dot" w:pos="9016"/>
         </w:tabs>
         <w:rPr>
+          <w:rFonts w:asciiTheme="minorHAnsi" w:eastAsiaTheme="minorEastAsia" w:hAnsiTheme="minorHAnsi" w:cstheme="minorBidi"/>
           <w:noProof/>
-        </w:rPr>
-      </w:pPr>
-      <w:hyperlink w:anchor="_Toc230534238" w:history="1">
+          <w:kern w:val="2"/>
+          <w:sz w:val="24"/>
+          <w:szCs w:val="30"/>
+          <w14:ligatures w14:val="standardContextual"/>
+        </w:rPr>
+      </w:pPr>
+      <w:hyperlink w:anchor="_Toc230535057" w:history="1">
         <w:r>
           <w:rPr>
             <w:rStyle w:val="Hyperlink"/>
@@ -2827,7 +3041,7 @@
             <w:noProof/>
             <w:webHidden/>
           </w:rPr>
-          <w:instrText xml:space="preserve"> PAGEREF _Toc230534238 \h </w:instrText>
+          <w:instrText xml:space="preserve"> PAGEREF _Toc230535057 \h </w:instrText>
         </w:r>
         <w:r>
           <w:rPr>
@@ -2847,7 +3061,7 @@
             <w:noProof/>
             <w:webHidden/>
           </w:rPr>
-          <w:t>11</w:t>
+          <w:t>12</w:t>
         </w:r>
         <w:r>
           <w:rPr>
@@ -2865,10 +3079,15 @@
           <w:tab w:val="right" w:leader="dot" w:pos="9016"/>
         </w:tabs>
         <w:rPr>
+          <w:rFonts w:asciiTheme="minorHAnsi" w:eastAsiaTheme="minorEastAsia" w:hAnsiTheme="minorHAnsi" w:cstheme="minorBidi"/>
           <w:noProof/>
-        </w:rPr>
-      </w:pPr>
-      <w:hyperlink w:anchor="_Toc230534239" w:history="1">
+          <w:kern w:val="2"/>
+          <w:sz w:val="24"/>
+          <w:szCs w:val="30"/>
+          <w14:ligatures w14:val="standardContextual"/>
+        </w:rPr>
+      </w:pPr>
+      <w:hyperlink w:anchor="_Toc230535058" w:history="1">
         <w:r>
           <w:rPr>
             <w:rStyle w:val="Hyperlink"/>
@@ -2896,7 +3115,7 @@
             <w:noProof/>
             <w:webHidden/>
           </w:rPr>
-          <w:instrText xml:space="preserve"> PAGEREF _Toc230534239 \h </w:instrText>
+          <w:instrText xml:space="preserve"> PAGEREF _Toc230535058 \h </w:instrText>
         </w:r>
         <w:r>
           <w:rPr>
@@ -2916,7 +3135,7 @@
             <w:noProof/>
             <w:webHidden/>
           </w:rPr>
-          <w:t>11</w:t>
+          <w:t>12</w:t>
         </w:r>
         <w:r>
           <w:rPr>
@@ -2934,10 +3153,15 @@
           <w:tab w:val="right" w:leader="dot" w:pos="9016"/>
         </w:tabs>
         <w:rPr>
+          <w:rFonts w:asciiTheme="minorHAnsi" w:eastAsiaTheme="minorEastAsia" w:hAnsiTheme="minorHAnsi" w:cstheme="minorBidi"/>
           <w:noProof/>
-        </w:rPr>
-      </w:pPr>
-      <w:hyperlink w:anchor="_Toc230534240" w:history="1">
+          <w:kern w:val="2"/>
+          <w:sz w:val="24"/>
+          <w:szCs w:val="30"/>
+          <w14:ligatures w14:val="standardContextual"/>
+        </w:rPr>
+      </w:pPr>
+      <w:hyperlink w:anchor="_Toc230535059" w:history="1">
         <w:r>
           <w:rPr>
             <w:rStyle w:val="Hyperlink"/>
@@ -2965,7 +3189,7 @@
             <w:noProof/>
             <w:webHidden/>
           </w:rPr>
-          <w:instrText xml:space="preserve"> PAGEREF _Toc230534240 \h </w:instrText>
+          <w:instrText xml:space="preserve"> PAGEREF _Toc230535059 \h </w:instrText>
         </w:r>
         <w:r>
           <w:rPr>
@@ -2985,7 +3209,7 @@
             <w:noProof/>
             <w:webHidden/>
           </w:rPr>
-          <w:t>12</w:t>
+          <w:t>13</w:t>
         </w:r>
         <w:r>
           <w:rPr>
@@ -3003,10 +3227,15 @@
           <w:tab w:val="right" w:leader="dot" w:pos="9016"/>
         </w:tabs>
         <w:rPr>
+          <w:rFonts w:asciiTheme="minorHAnsi" w:eastAsiaTheme="minorEastAsia" w:hAnsiTheme="minorHAnsi" w:cstheme="minorBidi"/>
           <w:noProof/>
-        </w:rPr>
-      </w:pPr>
-      <w:hyperlink w:anchor="_Toc230534241" w:history="1">
+          <w:kern w:val="2"/>
+          <w:sz w:val="24"/>
+          <w:szCs w:val="30"/>
+          <w14:ligatures w14:val="standardContextual"/>
+        </w:rPr>
+      </w:pPr>
+      <w:hyperlink w:anchor="_Toc230535060" w:history="1">
         <w:r>
           <w:rPr>
             <w:rStyle w:val="Hyperlink"/>
@@ -3034,7 +3263,7 @@
             <w:noProof/>
             <w:webHidden/>
           </w:rPr>
-          <w:instrText xml:space="preserve"> PAGEREF _Toc230534241 \h </w:instrText>
+          <w:instrText xml:space="preserve"> PAGEREF _Toc230535060 \h </w:instrText>
         </w:r>
         <w:r>
           <w:rPr>
@@ -3054,7 +3283,7 @@
             <w:noProof/>
             <w:webHidden/>
           </w:rPr>
-          <w:t>12</w:t>
+          <w:t>13</w:t>
         </w:r>
         <w:r>
           <w:rPr>
@@ -3072,10 +3301,15 @@
           <w:tab w:val="right" w:leader="dot" w:pos="9016"/>
         </w:tabs>
         <w:rPr>
+          <w:rFonts w:asciiTheme="minorHAnsi" w:eastAsiaTheme="minorEastAsia" w:hAnsiTheme="minorHAnsi" w:cstheme="minorBidi"/>
           <w:noProof/>
-        </w:rPr>
-      </w:pPr>
-      <w:hyperlink w:anchor="_Toc230534242" w:history="1">
+          <w:kern w:val="2"/>
+          <w:sz w:val="24"/>
+          <w:szCs w:val="30"/>
+          <w14:ligatures w14:val="standardContextual"/>
+        </w:rPr>
+      </w:pPr>
+      <w:hyperlink w:anchor="_Toc230535061" w:history="1">
         <w:r>
           <w:rPr>
             <w:rStyle w:val="Hyperlink"/>
@@ -3103,7 +3337,7 @@
             <w:noProof/>
             <w:webHidden/>
           </w:rPr>
-          <w:instrText xml:space="preserve"> PAGEREF _Toc230534242 \h </w:instrText>
+          <w:instrText xml:space="preserve"> PAGEREF _Toc230535061 \h </w:instrText>
         </w:r>
         <w:r>
           <w:rPr>
@@ -3123,7 +3357,7 @@
             <w:noProof/>
             <w:webHidden/>
           </w:rPr>
-          <w:t>16</w:t>
+          <w:t>17</w:t>
         </w:r>
         <w:r>
           <w:rPr>
@@ -3141,10 +3375,15 @@
           <w:tab w:val="right" w:leader="dot" w:pos="9016"/>
         </w:tabs>
         <w:rPr>
+          <w:rFonts w:asciiTheme="minorHAnsi" w:eastAsiaTheme="minorEastAsia" w:hAnsiTheme="minorHAnsi" w:cstheme="minorBidi"/>
           <w:noProof/>
-        </w:rPr>
-      </w:pPr>
-      <w:hyperlink w:anchor="_Toc230534243" w:history="1">
+          <w:kern w:val="2"/>
+          <w:sz w:val="24"/>
+          <w:szCs w:val="30"/>
+          <w14:ligatures w14:val="standardContextual"/>
+        </w:rPr>
+      </w:pPr>
+      <w:hyperlink w:anchor="_Toc230535062" w:history="1">
         <w:r>
           <w:rPr>
             <w:rStyle w:val="Hyperlink"/>
@@ -3172,7 +3411,7 @@
             <w:noProof/>
             <w:webHidden/>
           </w:rPr>
-          <w:instrText xml:space="preserve"> PAGEREF _Toc230534243 \h </w:instrText>
+          <w:instrText xml:space="preserve"> PAGEREF _Toc230535062 \h </w:instrText>
         </w:r>
         <w:r>
           <w:rPr>
@@ -3192,7 +3431,7 @@
             <w:noProof/>
             <w:webHidden/>
           </w:rPr>
-          <w:t>19</w:t>
+          <w:t>20</w:t>
         </w:r>
         <w:r>
           <w:rPr>
@@ -3210,10 +3449,15 @@
           <w:tab w:val="right" w:leader="dot" w:pos="9016"/>
         </w:tabs>
         <w:rPr>
+          <w:rFonts w:asciiTheme="minorHAnsi" w:eastAsiaTheme="minorEastAsia" w:hAnsiTheme="minorHAnsi" w:cstheme="minorBidi"/>
           <w:noProof/>
-        </w:rPr>
-      </w:pPr>
-      <w:hyperlink w:anchor="_Toc230534244" w:history="1">
+          <w:kern w:val="2"/>
+          <w:sz w:val="24"/>
+          <w:szCs w:val="30"/>
+          <w14:ligatures w14:val="standardContextual"/>
+        </w:rPr>
+      </w:pPr>
+      <w:hyperlink w:anchor="_Toc230535063" w:history="1">
         <w:r>
           <w:rPr>
             <w:rStyle w:val="Hyperlink"/>
@@ -3241,7 +3485,7 @@
             <w:noProof/>
             <w:webHidden/>
           </w:rPr>
-          <w:instrText xml:space="preserve"> PAGEREF _Toc230534244 \h </w:instrText>
+          <w:instrText xml:space="preserve"> PAGEREF _Toc230535063 \h </w:instrText>
         </w:r>
         <w:r>
           <w:rPr>
@@ -3261,7 +3505,7 @@
             <w:noProof/>
             <w:webHidden/>
           </w:rPr>
-          <w:t>19</w:t>
+          <w:t>20</w:t>
         </w:r>
         <w:r>
           <w:rPr>
@@ -3279,10 +3523,15 @@
           <w:tab w:val="right" w:leader="dot" w:pos="9016"/>
         </w:tabs>
         <w:rPr>
+          <w:rFonts w:asciiTheme="minorHAnsi" w:eastAsiaTheme="minorEastAsia" w:hAnsiTheme="minorHAnsi" w:cstheme="minorBidi"/>
           <w:noProof/>
-        </w:rPr>
-      </w:pPr>
-      <w:hyperlink w:anchor="_Toc230534245" w:history="1">
+          <w:kern w:val="2"/>
+          <w:sz w:val="24"/>
+          <w:szCs w:val="30"/>
+          <w14:ligatures w14:val="standardContextual"/>
+        </w:rPr>
+      </w:pPr>
+      <w:hyperlink w:anchor="_Toc230535064" w:history="1">
         <w:r>
           <w:rPr>
             <w:rStyle w:val="Hyperlink"/>
@@ -3310,7 +3559,7 @@
             <w:noProof/>
             <w:webHidden/>
           </w:rPr>
-          <w:instrText xml:space="preserve"> PAGEREF _Toc230534245 \h </w:instrText>
+          <w:instrText xml:space="preserve"> PAGEREF _Toc230535064 \h </w:instrText>
         </w:r>
         <w:r>
           <w:rPr>
@@ -3330,7 +3579,7 @@
             <w:noProof/>
             <w:webHidden/>
           </w:rPr>
-          <w:t>20</w:t>
+          <w:t>21</w:t>
         </w:r>
         <w:r>
           <w:rPr>
@@ -3348,10 +3597,15 @@
           <w:tab w:val="right" w:leader="dot" w:pos="9016"/>
         </w:tabs>
         <w:rPr>
+          <w:rFonts w:asciiTheme="minorHAnsi" w:eastAsiaTheme="minorEastAsia" w:hAnsiTheme="minorHAnsi" w:cstheme="minorBidi"/>
           <w:noProof/>
-        </w:rPr>
-      </w:pPr>
-      <w:hyperlink w:anchor="_Toc230534246" w:history="1">
+          <w:kern w:val="2"/>
+          <w:sz w:val="24"/>
+          <w:szCs w:val="30"/>
+          <w14:ligatures w14:val="standardContextual"/>
+        </w:rPr>
+      </w:pPr>
+      <w:hyperlink w:anchor="_Toc230535065" w:history="1">
         <w:r>
           <w:rPr>
             <w:rStyle w:val="Hyperlink"/>
@@ -3379,7 +3633,7 @@
             <w:noProof/>
             <w:webHidden/>
           </w:rPr>
-          <w:instrText xml:space="preserve"> PAGEREF _Toc230534246 \h </w:instrText>
+          <w:instrText xml:space="preserve"> PAGEREF _Toc230535065 \h </w:instrText>
         </w:r>
         <w:r>
           <w:rPr>
@@ -3399,7 +3653,7 @@
             <w:noProof/>
             <w:webHidden/>
           </w:rPr>
-          <w:t>20</w:t>
+          <w:t>21</w:t>
         </w:r>
         <w:r>
           <w:rPr>
@@ -3417,10 +3671,15 @@
           <w:tab w:val="right" w:leader="dot" w:pos="9016"/>
         </w:tabs>
         <w:rPr>
+          <w:rFonts w:asciiTheme="minorHAnsi" w:eastAsiaTheme="minorEastAsia" w:hAnsiTheme="minorHAnsi" w:cstheme="minorBidi"/>
           <w:noProof/>
-        </w:rPr>
-      </w:pPr>
-      <w:hyperlink w:anchor="_Toc230534247" w:history="1">
+          <w:kern w:val="2"/>
+          <w:sz w:val="24"/>
+          <w:szCs w:val="30"/>
+          <w14:ligatures w14:val="standardContextual"/>
+        </w:rPr>
+      </w:pPr>
+      <w:hyperlink w:anchor="_Toc230535066" w:history="1">
         <w:r>
           <w:rPr>
             <w:rStyle w:val="Hyperlink"/>
@@ -3448,7 +3707,7 @@
             <w:noProof/>
             <w:webHidden/>
           </w:rPr>
-          <w:instrText xml:space="preserve"> PAGEREF _Toc230534247 \h </w:instrText>
+          <w:instrText xml:space="preserve"> PAGEREF _Toc230535066 \h </w:instrText>
         </w:r>
         <w:r>
           <w:rPr>
@@ -3468,7 +3727,7 @@
             <w:noProof/>
             <w:webHidden/>
           </w:rPr>
-          <w:t>20</w:t>
+          <w:t>21</w:t>
         </w:r>
         <w:r>
           <w:rPr>
@@ -3486,10 +3745,15 @@
           <w:tab w:val="right" w:leader="dot" w:pos="9016"/>
         </w:tabs>
         <w:rPr>
+          <w:rFonts w:asciiTheme="minorHAnsi" w:eastAsiaTheme="minorEastAsia" w:hAnsiTheme="minorHAnsi" w:cstheme="minorBidi"/>
           <w:noProof/>
-        </w:rPr>
-      </w:pPr>
-      <w:hyperlink w:anchor="_Toc230534248" w:history="1">
+          <w:kern w:val="2"/>
+          <w:sz w:val="24"/>
+          <w:szCs w:val="30"/>
+          <w14:ligatures w14:val="standardContextual"/>
+        </w:rPr>
+      </w:pPr>
+      <w:hyperlink w:anchor="_Toc230535067" w:history="1">
         <w:r>
           <w:rPr>
             <w:rStyle w:val="Hyperlink"/>
@@ -3517,7 +3781,7 @@
             <w:noProof/>
             <w:webHidden/>
           </w:rPr>
-          <w:instrText xml:space="preserve"> PAGEREF _Toc230534248 \h </w:instrText>
+          <w:instrText xml:space="preserve"> PAGEREF _Toc230535067 \h </w:instrText>
         </w:r>
         <w:r>
           <w:rPr>
@@ -3537,7 +3801,7 @@
             <w:noProof/>
             <w:webHidden/>
           </w:rPr>
-          <w:t>20</w:t>
+          <w:t>21</w:t>
         </w:r>
         <w:r>
           <w:rPr>
@@ -3555,10 +3819,15 @@
           <w:tab w:val="right" w:leader="dot" w:pos="9016"/>
         </w:tabs>
         <w:rPr>
+          <w:rFonts w:asciiTheme="minorHAnsi" w:eastAsiaTheme="minorEastAsia" w:hAnsiTheme="minorHAnsi" w:cstheme="minorBidi"/>
           <w:noProof/>
-        </w:rPr>
-      </w:pPr>
-      <w:hyperlink w:anchor="_Toc230534249" w:history="1">
+          <w:kern w:val="2"/>
+          <w:sz w:val="24"/>
+          <w:szCs w:val="30"/>
+          <w14:ligatures w14:val="standardContextual"/>
+        </w:rPr>
+      </w:pPr>
+      <w:hyperlink w:anchor="_Toc230535068" w:history="1">
         <w:r>
           <w:rPr>
             <w:rStyle w:val="Hyperlink"/>
@@ -3586,7 +3855,7 @@
             <w:noProof/>
             <w:webHidden/>
           </w:rPr>
-          <w:instrText xml:space="preserve"> PAGEREF _Toc230534249 \h </w:instrText>
+          <w:instrText xml:space="preserve"> PAGEREF _Toc230535068 \h </w:instrText>
         </w:r>
         <w:r>
           <w:rPr>
@@ -3606,7 +3875,7 @@
             <w:noProof/>
             <w:webHidden/>
           </w:rPr>
-          <w:t>20</w:t>
+          <w:t>21</w:t>
         </w:r>
         <w:r>
           <w:rPr>
@@ -3624,10 +3893,15 @@
           <w:tab w:val="right" w:leader="dot" w:pos="9016"/>
         </w:tabs>
         <w:rPr>
+          <w:rFonts w:asciiTheme="minorHAnsi" w:eastAsiaTheme="minorEastAsia" w:hAnsiTheme="minorHAnsi" w:cstheme="minorBidi"/>
           <w:noProof/>
-        </w:rPr>
-      </w:pPr>
-      <w:hyperlink w:anchor="_Toc230534250" w:history="1">
+          <w:kern w:val="2"/>
+          <w:sz w:val="24"/>
+          <w:szCs w:val="30"/>
+          <w14:ligatures w14:val="standardContextual"/>
+        </w:rPr>
+      </w:pPr>
+      <w:hyperlink w:anchor="_Toc230535069" w:history="1">
         <w:r>
           <w:rPr>
             <w:rStyle w:val="Hyperlink"/>
@@ -3655,7 +3929,7 @@
             <w:noProof/>
             <w:webHidden/>
           </w:rPr>
-          <w:instrText xml:space="preserve"> PAGEREF _Toc230534250 \h </w:instrText>
+          <w:instrText xml:space="preserve"> PAGEREF _Toc230535069 \h </w:instrText>
         </w:r>
         <w:r>
           <w:rPr>
@@ -3675,7 +3949,7 @@
             <w:noProof/>
             <w:webHidden/>
           </w:rPr>
-          <w:t>21</w:t>
+          <w:t>22</w:t>
         </w:r>
         <w:r>
           <w:rPr>
@@ -3693,10 +3967,15 @@
           <w:tab w:val="right" w:leader="dot" w:pos="9016"/>
         </w:tabs>
         <w:rPr>
+          <w:rFonts w:asciiTheme="minorHAnsi" w:eastAsiaTheme="minorEastAsia" w:hAnsiTheme="minorHAnsi" w:cstheme="minorBidi"/>
           <w:noProof/>
-        </w:rPr>
-      </w:pPr>
-      <w:hyperlink w:anchor="_Toc230534251" w:history="1">
+          <w:kern w:val="2"/>
+          <w:sz w:val="24"/>
+          <w:szCs w:val="30"/>
+          <w14:ligatures w14:val="standardContextual"/>
+        </w:rPr>
+      </w:pPr>
+      <w:hyperlink w:anchor="_Toc230535070" w:history="1">
         <w:r>
           <w:rPr>
             <w:rStyle w:val="Hyperlink"/>
@@ -3724,7 +4003,7 @@
             <w:noProof/>
             <w:webHidden/>
           </w:rPr>
-          <w:instrText xml:space="preserve"> PAGEREF _Toc230534251 \h </w:instrText>
+          <w:instrText xml:space="preserve"> PAGEREF _Toc230535070 \h </w:instrText>
         </w:r>
         <w:r>
           <w:rPr>
@@ -3744,7 +4023,7 @@
             <w:noProof/>
             <w:webHidden/>
           </w:rPr>
-          <w:t>21</w:t>
+          <w:t>22</w:t>
         </w:r>
         <w:r>
           <w:rPr>
@@ -3762,10 +4041,15 @@
           <w:tab w:val="right" w:leader="dot" w:pos="9016"/>
         </w:tabs>
         <w:rPr>
+          <w:rFonts w:asciiTheme="minorHAnsi" w:eastAsiaTheme="minorEastAsia" w:hAnsiTheme="minorHAnsi" w:cstheme="minorBidi"/>
           <w:noProof/>
-        </w:rPr>
-      </w:pPr>
-      <w:hyperlink w:anchor="_Toc230534252" w:history="1">
+          <w:kern w:val="2"/>
+          <w:sz w:val="24"/>
+          <w:szCs w:val="30"/>
+          <w14:ligatures w14:val="standardContextual"/>
+        </w:rPr>
+      </w:pPr>
+      <w:hyperlink w:anchor="_Toc230535071" w:history="1">
         <w:r>
           <w:rPr>
             <w:rStyle w:val="Hyperlink"/>
@@ -3793,7 +4077,7 @@
             <w:noProof/>
             <w:webHidden/>
           </w:rPr>
-          <w:instrText xml:space="preserve"> PAGEREF _Toc230534252 \h </w:instrText>
+          <w:instrText xml:space="preserve"> PAGEREF _Toc230535071 \h </w:instrText>
         </w:r>
         <w:r>
           <w:rPr>
@@ -3813,7 +4097,7 @@
             <w:noProof/>
             <w:webHidden/>
           </w:rPr>
-          <w:t>21</w:t>
+          <w:t>22</w:t>
         </w:r>
         <w:r>
           <w:rPr>
@@ -3831,11 +4115,15 @@
           <w:tab w:val="right" w:leader="dot" w:pos="9016"/>
         </w:tabs>
         <w:rPr>
-          <w:rStyle w:val="Hyperlink"/>
+          <w:rFonts w:asciiTheme="minorHAnsi" w:eastAsiaTheme="minorEastAsia" w:hAnsiTheme="minorHAnsi" w:cstheme="minorBidi"/>
           <w:noProof/>
-        </w:rPr>
-      </w:pPr>
-      <w:hyperlink w:anchor="_Toc230534253" w:history="1">
+          <w:kern w:val="2"/>
+          <w:sz w:val="24"/>
+          <w:szCs w:val="30"/>
+          <w14:ligatures w14:val="standardContextual"/>
+        </w:rPr>
+      </w:pPr>
+      <w:hyperlink w:anchor="_Toc230535072" w:history="1">
         <w:r>
           <w:rPr>
             <w:rStyle w:val="Hyperlink"/>
@@ -3863,7 +4151,7 @@
             <w:noProof/>
             <w:webHidden/>
           </w:rPr>
-          <w:instrText xml:space="preserve"> PAGEREF _Toc230534253 \h </w:instrText>
+          <w:instrText xml:space="preserve"> PAGEREF _Toc230535072 \h </w:instrText>
         </w:r>
         <w:r>
           <w:rPr>
@@ -3883,7 +4171,7 @@
             <w:noProof/>
             <w:webHidden/>
           </w:rPr>
-          <w:t>22</w:t>
+          <w:t>23</w:t>
         </w:r>
         <w:r>
           <w:rPr>
@@ -3894,43 +4182,9 @@
         </w:r>
       </w:hyperlink>
     </w:p>
-    <w:p/>
-    <w:p/>
-    <w:p/>
-    <w:p/>
-    <w:p/>
-    <w:p/>
-    <w:p/>
-    <w:p/>
-    <w:p/>
-    <w:p/>
-    <w:p/>
-    <w:p/>
-    <w:p/>
-    <w:p/>
-    <w:p/>
-    <w:p/>
-    <w:p/>
-    <w:p/>
-    <w:p/>
-    <w:p/>
-    <w:p/>
-    <w:p/>
-    <w:p/>
-    <w:p/>
-    <w:p/>
-    <w:p/>
-    <w:p/>
-    <w:p/>
-    <w:p/>
     <w:p>
       <w:pPr>
         <w:pStyle w:val="Heading1"/>
-        <w:rPr>
-          <w:rFonts w:ascii="Times New Roman" w:hAnsi="Times New Roman" w:cs="Times New Roman"/>
-        </w:rPr>
-      </w:pPr>
-      <w:r>
         <w:rPr>
           <w:rFonts w:ascii="Times New Roman" w:hAnsi="Times New Roman" w:cs="Times New Roman"/>
           <w:b w:val="0"/>
@@ -3939,14 +4193,43 @@
           <w:sz w:val="22"/>
           <w:szCs w:val="22"/>
         </w:rPr>
+      </w:pPr>
+      <w:r>
+        <w:rPr>
+          <w:rFonts w:ascii="Times New Roman" w:hAnsi="Times New Roman" w:cs="Times New Roman"/>
+          <w:b w:val="0"/>
+          <w:bCs w:val="0"/>
+          <w:color w:val="auto"/>
+          <w:sz w:val="22"/>
+          <w:szCs w:val="22"/>
+        </w:rPr>
+        <w:fldChar w:fldCharType="end"/>
+      </w:r>
+      <w:bookmarkStart w:id="2" w:name="_Toc230535031"/>
+      <w:r>
+        <w:rPr>
+          <w:rFonts w:ascii="Times New Roman" w:hAnsi="Times New Roman" w:cs="Times New Roman"/>
+          <w:b w:val="0"/>
+          <w:bCs w:val="0"/>
+          <w:color w:val="auto"/>
+          <w:sz w:val="22"/>
+          <w:szCs w:val="22"/>
+        </w:rPr>
+        <w:br w:type="page"/>
+      </w:r>
+    </w:p>
+    <w:p>
+      <w:pPr>
+        <w:pStyle w:val="Heading1"/>
+        <w:rPr>
+          <w:rFonts w:ascii="Times New Roman" w:hAnsi="Times New Roman" w:cs="Times New Roman"/>
+        </w:rPr>
+      </w:pPr>
+      <w:r>
+        <w:rPr>
+          <w:rFonts w:ascii="Times New Roman" w:hAnsi="Times New Roman" w:cs="Times New Roman"/>
+        </w:rPr>
         <w:lastRenderedPageBreak/>
-        <w:fldChar w:fldCharType="end"/>
-      </w:r>
-      <w:bookmarkStart w:id="2" w:name="_Toc230534213"/>
-      <w:r>
-        <w:rPr>
-          <w:rFonts w:ascii="Times New Roman" w:hAnsi="Times New Roman" w:cs="Times New Roman"/>
-        </w:rPr>
         <w:t>1. GIỚI THIỆU</w:t>
       </w:r>
       <w:bookmarkEnd w:id="2"/>
@@ -3958,7 +4241,7 @@
           <w:rFonts w:ascii="Times New Roman" w:hAnsi="Times New Roman" w:cs="Times New Roman"/>
         </w:rPr>
       </w:pPr>
-      <w:bookmarkStart w:id="3" w:name="_Toc230534214"/>
+      <w:bookmarkStart w:id="3" w:name="_Toc230535032"/>
       <w:r>
         <w:rPr>
           <w:rFonts w:ascii="Times New Roman" w:hAnsi="Times New Roman" w:cs="Times New Roman"/>
@@ -4061,7 +4344,7 @@
           <w:rFonts w:ascii="Times New Roman" w:hAnsi="Times New Roman" w:cs="Times New Roman"/>
         </w:rPr>
       </w:pPr>
-      <w:bookmarkStart w:id="4" w:name="_Toc230534215"/>
+      <w:bookmarkStart w:id="4" w:name="_Toc230535033"/>
       <w:r>
         <w:rPr>
           <w:rFonts w:ascii="Times New Roman" w:hAnsi="Times New Roman" w:cs="Times New Roman"/>
@@ -4092,7 +4375,7 @@
           <w:rFonts w:ascii="Times New Roman" w:hAnsi="Times New Roman" w:cs="Times New Roman"/>
         </w:rPr>
       </w:pPr>
-      <w:bookmarkStart w:id="5" w:name="_Toc230534216"/>
+      <w:bookmarkStart w:id="5" w:name="_Toc230535034"/>
       <w:r>
         <w:rPr>
           <w:rFonts w:ascii="Times New Roman" w:hAnsi="Times New Roman" w:cs="Times New Roman"/>
@@ -4872,7 +5155,7 @@
           <w:rFonts w:ascii="Times New Roman" w:hAnsi="Times New Roman" w:cs="Times New Roman"/>
         </w:rPr>
       </w:pPr>
-      <w:bookmarkStart w:id="6" w:name="_Toc230534217"/>
+      <w:bookmarkStart w:id="6" w:name="_Toc230535035"/>
       <w:r>
         <w:rPr>
           <w:rFonts w:ascii="Times New Roman" w:hAnsi="Times New Roman" w:cs="Times New Roman"/>
@@ -4945,7 +5228,7 @@
           <w:rFonts w:ascii="Times New Roman" w:hAnsi="Times New Roman" w:cs="Times New Roman"/>
         </w:rPr>
       </w:pPr>
-      <w:bookmarkStart w:id="7" w:name="_Toc230534218"/>
+      <w:bookmarkStart w:id="7" w:name="_Toc230535036"/>
       <w:r>
         <w:rPr>
           <w:rFonts w:ascii="Times New Roman" w:hAnsi="Times New Roman" w:cs="Times New Roman"/>
@@ -5317,7 +5600,7 @@
           <w:rFonts w:ascii="Times New Roman" w:hAnsi="Times New Roman" w:cs="Times New Roman"/>
         </w:rPr>
       </w:pPr>
-      <w:bookmarkStart w:id="8" w:name="_Toc230534219"/>
+      <w:bookmarkStart w:id="8" w:name="_Toc230535037"/>
       <w:r>
         <w:rPr>
           <w:rFonts w:ascii="Times New Roman" w:hAnsi="Times New Roman" w:cs="Times New Roman"/>
@@ -5437,7 +5720,7 @@
           <w:rFonts w:ascii="Times New Roman" w:hAnsi="Times New Roman" w:cs="Times New Roman"/>
         </w:rPr>
       </w:pPr>
-      <w:bookmarkStart w:id="9" w:name="_Toc230534220"/>
+      <w:bookmarkStart w:id="9" w:name="_Toc230535038"/>
       <w:r>
         <w:rPr>
           <w:rFonts w:ascii="Times New Roman" w:hAnsi="Times New Roman" w:cs="Times New Roman"/>
@@ -5530,7 +5813,7 @@
           <w:rFonts w:ascii="Times New Roman" w:hAnsi="Times New Roman" w:cs="Times New Roman"/>
         </w:rPr>
       </w:pPr>
-      <w:bookmarkStart w:id="10" w:name="_Toc230534221"/>
+      <w:bookmarkStart w:id="10" w:name="_Toc230535039"/>
       <w:r>
         <w:rPr>
           <w:rFonts w:ascii="Times New Roman" w:hAnsi="Times New Roman" w:cs="Times New Roman"/>
@@ -5585,6 +5868,137 @@
           <w:rFonts w:ascii="Times New Roman" w:hAnsi="Times New Roman" w:cs="Times New Roman"/>
         </w:rPr>
       </w:pPr>
+    </w:p>
+    <w:p>
+      <w:pPr>
+        <w:pStyle w:val="Heading2"/>
+        <w:rPr>
+          <w:rFonts w:ascii="Times New Roman" w:hAnsi="Times New Roman" w:cs="Times New Roman"/>
+        </w:rPr>
+      </w:pPr>
+      <w:bookmarkStart w:id="11" w:name="_Toc230535040"/>
+      <w:r>
+        <w:rPr>
+          <w:rFonts w:ascii="Times New Roman" w:hAnsi="Times New Roman" w:cs="Times New Roman"/>
+        </w:rPr>
+        <w:t>1.</w:t>
+      </w:r>
+      <w:r>
+        <w:rPr>
+          <w:rFonts w:ascii="Times New Roman" w:hAnsi="Times New Roman" w:cs="Times New Roman"/>
+        </w:rPr>
+        <w:t>3</w:t>
+      </w:r>
+      <w:r>
+        <w:rPr>
+          <w:rFonts w:ascii="Times New Roman" w:hAnsi="Times New Roman" w:cs="Times New Roman"/>
+        </w:rPr>
+        <w:t xml:space="preserve">. </w:t>
+      </w:r>
+      <w:r>
+        <w:rPr>
+          <w:rFonts w:ascii="Times New Roman" w:hAnsi="Times New Roman" w:cs="Times New Roman"/>
+        </w:rPr>
+        <w:t>Cân nhắc đạo đức (Ethical Considerations)</w:t>
+      </w:r>
+      <w:bookmarkEnd w:id="11"/>
+    </w:p>
+    <w:p>
+      <w:pPr>
+        <w:spacing w:line="360" w:lineRule="auto"/>
+        <w:rPr>
+          <w:rFonts w:ascii="Times New Roman" w:hAnsi="Times New Roman" w:cs="Times New Roman"/>
+        </w:rPr>
+      </w:pPr>
+      <w:r>
+        <w:rPr>
+          <w:rFonts w:ascii="Times New Roman" w:hAnsi="Times New Roman" w:cs="Times New Roman"/>
+        </w:rPr>
+        <w:t>Hệ thống triển khai trong môi trường dân cư, do đó nhóm xác định ba nguyên tắc đạo đức cốt lõi:</w:t>
+      </w:r>
+    </w:p>
+    <w:p>
+      <w:pPr>
+        <w:pStyle w:val="ListParagraph"/>
+        <w:numPr>
+          <w:ilvl w:val="0"/>
+          <w:numId w:val="9"/>
+        </w:numPr>
+        <w:spacing w:line="360" w:lineRule="auto"/>
+        <w:rPr>
+          <w:rFonts w:ascii="Times New Roman" w:hAnsi="Times New Roman" w:cs="Times New Roman"/>
+        </w:rPr>
+      </w:pPr>
+      <w:r>
+        <w:rPr>
+          <w:rFonts w:ascii="Times New Roman" w:hAnsi="Times New Roman" w:cs="Times New Roman"/>
+        </w:rPr>
+        <w:t>Không xâm phạm quyền riêng tư cá nhân.</w:t>
+      </w:r>
+      <w:r>
+        <w:rPr>
+          <w:rFonts w:ascii="Times New Roman" w:hAnsi="Times New Roman" w:cs="Times New Roman"/>
+        </w:rPr>
+        <w:t xml:space="preserve"> Camera chỉ ghi nhận hành vi nhóm tại hành lang công cộng — không quay bên trong căn hộ, không lưu khuôn mặt, không định danh cá nhân. Dữ liệu sinh trắc học được thay thế bằng hash đặc trưng hành vi, tuân thủ Nghị định 13/2023/NĐ-CP.</w:t>
+      </w:r>
+    </w:p>
+    <w:p>
+      <w:pPr>
+        <w:pStyle w:val="ListParagraph"/>
+        <w:numPr>
+          <w:ilvl w:val="0"/>
+          <w:numId w:val="9"/>
+        </w:numPr>
+        <w:spacing w:line="360" w:lineRule="auto"/>
+        <w:rPr>
+          <w:rFonts w:ascii="Times New Roman" w:hAnsi="Times New Roman" w:cs="Times New Roman"/>
+        </w:rPr>
+      </w:pPr>
+      <w:r>
+        <w:rPr>
+          <w:rFonts w:ascii="Times New Roman" w:hAnsi="Times New Roman" w:cs="Times New Roman"/>
+        </w:rPr>
+        <w:t xml:space="preserve">Minh bạch trong ra quyết định. </w:t>
+      </w:r>
+      <w:r>
+        <w:rPr>
+          <w:rFonts w:ascii="Times New Roman" w:hAnsi="Times New Roman" w:cs="Times New Roman"/>
+        </w:rPr>
+        <w:t>Mọi cảnh báo đều đi kèm triggered_rules[] và risk_score có thể giải thích — ban quản lý tòa nhà biết rõ lý do trước khi hành động, tránh phân biệt đối xử tùy tiện.</w:t>
+      </w:r>
+    </w:p>
+    <w:p>
+      <w:pPr>
+        <w:pStyle w:val="ListParagraph"/>
+        <w:numPr>
+          <w:ilvl w:val="0"/>
+          <w:numId w:val="9"/>
+        </w:numPr>
+        <w:spacing w:line="360" w:lineRule="auto"/>
+        <w:rPr>
+          <w:rFonts w:ascii="Times New Roman" w:hAnsi="Times New Roman" w:cs="Times New Roman"/>
+        </w:rPr>
+      </w:pPr>
+      <w:r>
+        <w:rPr>
+          <w:rFonts w:ascii="Times New Roman" w:hAnsi="Times New Roman" w:cs="Times New Roman"/>
+        </w:rPr>
+        <w:t xml:space="preserve">Tỷ lệ cảnh báo sai (False Positive) được kiểm soát. </w:t>
+      </w:r>
+      <w:r>
+        <w:rPr>
+          <w:rFonts w:ascii="Times New Roman" w:hAnsi="Times New Roman" w:cs="Times New Roman"/>
+        </w:rPr>
+        <w:t>Cư dân bình thường bị gắn cờ oan là tổn hại đạo đức nghiêm trọng — hệ thống thiết kế để yêu cầu xác nhận của con người trước khi đưa ra kết luận cuối cùng, không tự động xử phạt.</w:t>
+      </w:r>
+    </w:p>
+    <w:p>
+      <w:pPr>
+        <w:spacing w:line="360" w:lineRule="auto"/>
+        <w:rPr>
+          <w:rFonts w:ascii="Times New Roman" w:hAnsi="Times New Roman" w:cs="Times New Roman"/>
+        </w:rPr>
+      </w:pPr>
       <w:r>
         <w:rPr>
           <w:rFonts w:ascii="Times New Roman" w:hAnsi="Times New Roman" w:cs="Times New Roman"/>
@@ -5599,7 +6013,7 @@
           <w:rFonts w:ascii="Times New Roman" w:hAnsi="Times New Roman" w:cs="Times New Roman"/>
         </w:rPr>
       </w:pPr>
-      <w:bookmarkStart w:id="11" w:name="_Toc230534222"/>
+      <w:bookmarkStart w:id="12" w:name="_Toc230535041"/>
       <w:r>
         <w:rPr>
           <w:rFonts w:ascii="Times New Roman" w:hAnsi="Times New Roman" w:cs="Times New Roman"/>
@@ -5607,7 +6021,7 @@
         <w:lastRenderedPageBreak/>
         <w:t>2. PHÂN TÍCH BÀI TOÁN (COMPUTATIONAL THINKING)</w:t>
       </w:r>
-      <w:bookmarkEnd w:id="11"/>
+      <w:bookmarkEnd w:id="12"/>
     </w:p>
     <w:p>
       <w:pPr>
@@ -5616,14 +6030,14 @@
           <w:rFonts w:ascii="Times New Roman" w:hAnsi="Times New Roman" w:cs="Times New Roman"/>
         </w:rPr>
       </w:pPr>
-      <w:bookmarkStart w:id="12" w:name="_Toc230534223"/>
+      <w:bookmarkStart w:id="13" w:name="_Toc230535042"/>
       <w:r>
         <w:rPr>
           <w:rFonts w:ascii="Times New Roman" w:hAnsi="Times New Roman" w:cs="Times New Roman"/>
         </w:rPr>
         <w:t>2.1. Decomposition — Phân rã bài toán</w:t>
       </w:r>
-      <w:bookmarkEnd w:id="12"/>
+      <w:bookmarkEnd w:id="13"/>
     </w:p>
     <w:p>
       <w:pPr>
@@ -6100,14 +6514,14 @@
           <w:rFonts w:ascii="Times New Roman" w:hAnsi="Times New Roman" w:cs="Times New Roman"/>
         </w:rPr>
       </w:pPr>
-      <w:bookmarkStart w:id="13" w:name="_Toc230534224"/>
+      <w:bookmarkStart w:id="14" w:name="_Toc230535043"/>
       <w:r>
         <w:rPr>
           <w:rFonts w:ascii="Times New Roman" w:hAnsi="Times New Roman" w:cs="Times New Roman"/>
         </w:rPr>
         <w:t>2.2. Pattern Recognition — Nhận diện mẫu</w:t>
       </w:r>
-      <w:bookmarkEnd w:id="13"/>
+      <w:bookmarkEnd w:id="14"/>
     </w:p>
     <w:p>
       <w:pPr>
@@ -6584,14 +6998,14 @@
           <w:rFonts w:ascii="Times New Roman" w:hAnsi="Times New Roman" w:cs="Times New Roman"/>
         </w:rPr>
       </w:pPr>
-      <w:bookmarkStart w:id="14" w:name="_Toc230534225"/>
+      <w:bookmarkStart w:id="15" w:name="_Toc230535044"/>
       <w:r>
         <w:rPr>
           <w:rFonts w:ascii="Times New Roman" w:hAnsi="Times New Roman" w:cs="Times New Roman"/>
         </w:rPr>
         <w:t>2.3. Abstraction — Trừu tượng hóa</w:t>
       </w:r>
-      <w:bookmarkEnd w:id="14"/>
+      <w:bookmarkEnd w:id="15"/>
     </w:p>
     <w:p>
       <w:pPr>
@@ -7317,14 +7731,14 @@
           <w:rFonts w:ascii="Times New Roman" w:hAnsi="Times New Roman" w:cs="Times New Roman"/>
         </w:rPr>
       </w:pPr>
-      <w:bookmarkStart w:id="15" w:name="_Toc230534226"/>
+      <w:bookmarkStart w:id="16" w:name="_Toc230535045"/>
       <w:r>
         <w:rPr>
           <w:rFonts w:ascii="Times New Roman" w:hAnsi="Times New Roman" w:cs="Times New Roman"/>
         </w:rPr>
         <w:t>2.4. Algorithm Design — Thiết kế thuật toán</w:t>
       </w:r>
-      <w:bookmarkEnd w:id="15"/>
+      <w:bookmarkEnd w:id="16"/>
     </w:p>
     <w:p>
       <w:pPr>
@@ -7437,7 +7851,7 @@
           <w:rFonts w:ascii="Times New Roman" w:hAnsi="Times New Roman" w:cs="Times New Roman"/>
         </w:rPr>
       </w:pPr>
-      <w:bookmarkStart w:id="16" w:name="_Toc230534227"/>
+      <w:bookmarkStart w:id="17" w:name="_Toc230535046"/>
       <w:r>
         <w:rPr>
           <w:rFonts w:ascii="Times New Roman" w:hAnsi="Times New Roman" w:cs="Times New Roman"/>
@@ -7445,7 +7859,7 @@
         <w:lastRenderedPageBreak/>
         <w:t>3. PHƯƠNG PHÁP (METHODOLOGY)</w:t>
       </w:r>
-      <w:bookmarkEnd w:id="16"/>
+      <w:bookmarkEnd w:id="17"/>
     </w:p>
     <w:p>
       <w:pPr>
@@ -7454,14 +7868,14 @@
           <w:rFonts w:ascii="Times New Roman" w:hAnsi="Times New Roman" w:cs="Times New Roman"/>
         </w:rPr>
       </w:pPr>
-      <w:bookmarkStart w:id="17" w:name="_Toc230534228"/>
+      <w:bookmarkStart w:id="18" w:name="_Toc230535047"/>
       <w:r>
         <w:rPr>
           <w:rFonts w:ascii="Times New Roman" w:hAnsi="Times New Roman" w:cs="Times New Roman"/>
         </w:rPr>
         <w:t>3.1. Data Collection &amp; Preprocessing</w:t>
       </w:r>
-      <w:bookmarkEnd w:id="17"/>
+      <w:bookmarkEnd w:id="18"/>
     </w:p>
     <w:p>
       <w:pPr>
@@ -7968,14 +8382,14 @@
           <w:rFonts w:ascii="Times New Roman" w:hAnsi="Times New Roman" w:cs="Times New Roman"/>
         </w:rPr>
       </w:pPr>
-      <w:bookmarkStart w:id="18" w:name="_Toc230534229"/>
+      <w:bookmarkStart w:id="19" w:name="_Toc230535048"/>
       <w:r>
         <w:rPr>
           <w:rFonts w:ascii="Times New Roman" w:hAnsi="Times New Roman" w:cs="Times New Roman"/>
         </w:rPr>
         <w:t>3.2. Proposed Solution / Model</w:t>
       </w:r>
-      <w:bookmarkEnd w:id="18"/>
+      <w:bookmarkEnd w:id="19"/>
     </w:p>
     <w:p>
       <w:pPr>
@@ -7984,14 +8398,14 @@
           <w:rFonts w:ascii="Times New Roman" w:hAnsi="Times New Roman" w:cs="Times New Roman"/>
         </w:rPr>
       </w:pPr>
-      <w:bookmarkStart w:id="19" w:name="_Toc230534230"/>
+      <w:bookmarkStart w:id="20" w:name="_Toc230535049"/>
       <w:r>
         <w:rPr>
           <w:rFonts w:ascii="Times New Roman" w:hAnsi="Times New Roman" w:cs="Times New Roman"/>
         </w:rPr>
         <w:t>Ý tưởng cốt lõi (Main Idea)</w:t>
       </w:r>
-      <w:bookmarkEnd w:id="19"/>
+      <w:bookmarkEnd w:id="20"/>
     </w:p>
     <w:p>
       <w:pPr>
@@ -8149,14 +8563,14 @@
           <w:rFonts w:ascii="Times New Roman" w:hAnsi="Times New Roman" w:cs="Times New Roman"/>
         </w:rPr>
       </w:pPr>
-      <w:bookmarkStart w:id="20" w:name="_Toc230534231"/>
+      <w:bookmarkStart w:id="21" w:name="_Toc230535050"/>
       <w:r>
         <w:rPr>
           <w:rFonts w:ascii="Times New Roman" w:hAnsi="Times New Roman" w:cs="Times New Roman"/>
         </w:rPr>
         <w:t>Kiến trúc tổng thể (Architecture Overview)</w:t>
       </w:r>
-      <w:bookmarkEnd w:id="20"/>
+      <w:bookmarkEnd w:id="21"/>
     </w:p>
     <w:p>
       <w:pPr>
@@ -8459,14 +8873,14 @@
           <w:rFonts w:ascii="Times New Roman" w:hAnsi="Times New Roman" w:cs="Times New Roman"/>
         </w:rPr>
       </w:pPr>
-      <w:bookmarkStart w:id="21" w:name="_Toc230534232"/>
+      <w:bookmarkStart w:id="22" w:name="_Toc230535051"/>
       <w:r>
         <w:rPr>
           <w:rFonts w:ascii="Times New Roman" w:hAnsi="Times New Roman" w:cs="Times New Roman"/>
         </w:rPr>
         <w:t>(a) Rule-Based Classifier</w:t>
       </w:r>
-      <w:bookmarkEnd w:id="21"/>
+      <w:bookmarkEnd w:id="22"/>
     </w:p>
     <w:p>
       <w:pPr>
@@ -8577,14 +8991,14 @@
           <w:rFonts w:ascii="Times New Roman" w:hAnsi="Times New Roman" w:cs="Times New Roman"/>
         </w:rPr>
       </w:pPr>
-      <w:bookmarkStart w:id="22" w:name="_Toc230534233"/>
+      <w:bookmarkStart w:id="23" w:name="_Toc230535052"/>
       <w:r>
         <w:rPr>
           <w:rFonts w:ascii="Times New Roman" w:hAnsi="Times New Roman" w:cs="Times New Roman"/>
         </w:rPr>
         <w:t>(b) Machine Learning Classifiers</w:t>
       </w:r>
-      <w:bookmarkEnd w:id="22"/>
+      <w:bookmarkEnd w:id="23"/>
     </w:p>
     <w:p>
       <w:pPr>
@@ -8686,14 +9100,14 @@
           <w:rFonts w:ascii="Times New Roman" w:hAnsi="Times New Roman" w:cs="Times New Roman"/>
         </w:rPr>
       </w:pPr>
-      <w:bookmarkStart w:id="23" w:name="_Toc230534234"/>
+      <w:bookmarkStart w:id="24" w:name="_Toc230535053"/>
       <w:r>
         <w:rPr>
           <w:rFonts w:ascii="Times New Roman" w:hAnsi="Times New Roman" w:cs="Times New Roman"/>
         </w:rPr>
         <w:t>(c) So sánh Rule-Based và ML Classifier</w:t>
       </w:r>
-      <w:bookmarkEnd w:id="23"/>
+      <w:bookmarkEnd w:id="24"/>
     </w:p>
     <w:p>
       <w:pPr>
@@ -9174,14 +9588,14 @@
           <w:rFonts w:ascii="Times New Roman" w:hAnsi="Times New Roman" w:cs="Times New Roman"/>
         </w:rPr>
       </w:pPr>
-      <w:bookmarkStart w:id="24" w:name="_Toc230534235"/>
+      <w:bookmarkStart w:id="25" w:name="_Toc230535054"/>
       <w:r>
         <w:rPr>
           <w:rFonts w:ascii="Times New Roman" w:hAnsi="Times New Roman" w:cs="Times New Roman"/>
         </w:rPr>
         <w:t>3.3. System Pipeline (End-to-End)</w:t>
       </w:r>
-      <w:bookmarkEnd w:id="24"/>
+      <w:bookmarkEnd w:id="25"/>
     </w:p>
     <w:p>
       <w:pPr>
@@ -9382,7 +9796,7 @@
           <w:rFonts w:ascii="Times New Roman" w:hAnsi="Times New Roman" w:cs="Times New Roman"/>
         </w:rPr>
       </w:pPr>
-      <w:bookmarkStart w:id="25" w:name="_Toc230534236"/>
+      <w:bookmarkStart w:id="26" w:name="_Toc230535055"/>
       <w:r>
         <w:rPr>
           <w:rFonts w:ascii="Times New Roman" w:hAnsi="Times New Roman" w:cs="Times New Roman"/>
@@ -9390,7 +9804,7 @@
         <w:lastRenderedPageBreak/>
         <w:t>4. TRIỂN KHAI &amp; KẾT QUẢ</w:t>
       </w:r>
-      <w:bookmarkEnd w:id="25"/>
+      <w:bookmarkEnd w:id="26"/>
     </w:p>
     <w:p>
       <w:pPr>
@@ -9399,14 +9813,14 @@
           <w:rFonts w:ascii="Times New Roman" w:hAnsi="Times New Roman" w:cs="Times New Roman"/>
         </w:rPr>
       </w:pPr>
-      <w:bookmarkStart w:id="26" w:name="_Toc230534237"/>
+      <w:bookmarkStart w:id="27" w:name="_Toc230535056"/>
       <w:r>
         <w:rPr>
           <w:rFonts w:ascii="Times New Roman" w:hAnsi="Times New Roman" w:cs="Times New Roman"/>
         </w:rPr>
         <w:t>4.1. System Workflow</w:t>
       </w:r>
-      <w:bookmarkEnd w:id="26"/>
+      <w:bookmarkEnd w:id="27"/>
     </w:p>
     <w:p>
       <w:pPr>
@@ -9548,14 +9962,14 @@
           <w:rFonts w:ascii="Times New Roman" w:hAnsi="Times New Roman" w:cs="Times New Roman"/>
         </w:rPr>
       </w:pPr>
-      <w:bookmarkStart w:id="27" w:name="_Toc230534238"/>
+      <w:bookmarkStart w:id="28" w:name="_Toc230535057"/>
       <w:r>
         <w:rPr>
           <w:rFonts w:ascii="Times New Roman" w:hAnsi="Times New Roman" w:cs="Times New Roman"/>
         </w:rPr>
         <w:t>4.2. Evaluation Metrics</w:t>
       </w:r>
-      <w:bookmarkEnd w:id="27"/>
+      <w:bookmarkEnd w:id="28"/>
     </w:p>
     <w:p>
       <w:pPr>
@@ -9787,14 +10201,14 @@
           <w:rFonts w:ascii="Times New Roman" w:hAnsi="Times New Roman" w:cs="Times New Roman"/>
         </w:rPr>
       </w:pPr>
-      <w:bookmarkStart w:id="28" w:name="_Toc230534239"/>
+      <w:bookmarkStart w:id="29" w:name="_Toc230535058"/>
       <w:r>
         <w:rPr>
           <w:rFonts w:ascii="Times New Roman" w:hAnsi="Times New Roman" w:cs="Times New Roman"/>
         </w:rPr>
         <w:t>Ma trận đối chiếu Yêu cầu – Chỉ số (Requirement–Metric Mapping)</w:t>
       </w:r>
-      <w:bookmarkEnd w:id="28"/>
+      <w:bookmarkEnd w:id="29"/>
     </w:p>
     <w:p>
       <w:pPr>
@@ -10138,14 +10552,14 @@
           <w:rFonts w:ascii="Times New Roman" w:hAnsi="Times New Roman" w:cs="Times New Roman"/>
         </w:rPr>
       </w:pPr>
-      <w:bookmarkStart w:id="29" w:name="_Toc230534240"/>
+      <w:bookmarkStart w:id="30" w:name="_Toc230535059"/>
       <w:r>
         <w:rPr>
           <w:rFonts w:ascii="Times New Roman" w:hAnsi="Times New Roman" w:cs="Times New Roman"/>
         </w:rPr>
         <w:t>4.3. Experimental Results</w:t>
       </w:r>
-      <w:bookmarkEnd w:id="29"/>
+      <w:bookmarkEnd w:id="30"/>
     </w:p>
     <w:p>
       <w:pPr>
@@ -10154,14 +10568,14 @@
           <w:rFonts w:ascii="Times New Roman" w:hAnsi="Times New Roman" w:cs="Times New Roman"/>
         </w:rPr>
       </w:pPr>
-      <w:bookmarkStart w:id="30" w:name="_Toc230534241"/>
+      <w:bookmarkStart w:id="31" w:name="_Toc230535060"/>
       <w:r>
         <w:rPr>
           <w:rFonts w:ascii="Times New Roman" w:hAnsi="Times New Roman" w:cs="Times New Roman"/>
         </w:rPr>
         <w:t>Exploratory Data Analysis</w:t>
       </w:r>
-      <w:bookmarkEnd w:id="30"/>
+      <w:bookmarkEnd w:id="31"/>
     </w:p>
     <w:p>
       <w:pPr>
@@ -10803,14 +11217,14 @@
           <w:rFonts w:ascii="Times New Roman" w:hAnsi="Times New Roman" w:cs="Times New Roman"/>
         </w:rPr>
       </w:pPr>
-      <w:bookmarkStart w:id="31" w:name="_Toc230534242"/>
+      <w:bookmarkStart w:id="32" w:name="_Toc230535061"/>
       <w:r>
         <w:rPr>
           <w:rFonts w:ascii="Times New Roman" w:hAnsi="Times New Roman" w:cs="Times New Roman"/>
         </w:rPr>
         <w:t>Classifier Performance</w:t>
       </w:r>
-      <w:bookmarkEnd w:id="31"/>
+      <w:bookmarkEnd w:id="32"/>
     </w:p>
     <w:p>
       <w:pPr>
@@ -13201,14 +13615,14 @@
           <w:rFonts w:ascii="Times New Roman" w:hAnsi="Times New Roman" w:cs="Times New Roman"/>
         </w:rPr>
       </w:pPr>
-      <w:bookmarkStart w:id="32" w:name="_Toc230534243"/>
+      <w:bookmarkStart w:id="33" w:name="_Toc230535062"/>
       <w:r>
         <w:rPr>
           <w:rFonts w:ascii="Times New Roman" w:hAnsi="Times New Roman" w:cs="Times New Roman"/>
         </w:rPr>
         <w:t>Demo dự đoán trên 5 căn hộ mẫu</w:t>
       </w:r>
-      <w:bookmarkEnd w:id="32"/>
+      <w:bookmarkEnd w:id="33"/>
     </w:p>
     <w:tbl>
       <w:tblPr>
@@ -14337,14 +14751,14 @@
           <w:rFonts w:ascii="Times New Roman" w:hAnsi="Times New Roman" w:cs="Times New Roman"/>
         </w:rPr>
       </w:pPr>
-      <w:bookmarkStart w:id="33" w:name="_Toc230534244"/>
+      <w:bookmarkStart w:id="34" w:name="_Toc230535063"/>
       <w:r>
         <w:rPr>
           <w:rFonts w:ascii="Times New Roman" w:hAnsi="Times New Roman" w:cs="Times New Roman"/>
         </w:rPr>
         <w:t>Discussion</w:t>
       </w:r>
-      <w:bookmarkEnd w:id="33"/>
+      <w:bookmarkEnd w:id="34"/>
     </w:p>
     <w:p>
       <w:pPr>
@@ -14454,7 +14868,7 @@
           <w:rFonts w:ascii="Times New Roman" w:hAnsi="Times New Roman" w:cs="Times New Roman"/>
         </w:rPr>
       </w:pPr>
-      <w:bookmarkStart w:id="34" w:name="_Toc230534245"/>
+      <w:bookmarkStart w:id="35" w:name="_Toc230535064"/>
       <w:r>
         <w:rPr>
           <w:rFonts w:ascii="Times New Roman" w:hAnsi="Times New Roman" w:cs="Times New Roman"/>
@@ -14462,7 +14876,7 @@
         <w:lastRenderedPageBreak/>
         <w:t>5. KẾT LUẬN &amp; HƯỚNG PHÁT TRIỂN</w:t>
       </w:r>
-      <w:bookmarkEnd w:id="34"/>
+      <w:bookmarkEnd w:id="35"/>
     </w:p>
     <w:p>
       <w:pPr>
@@ -14471,14 +14885,14 @@
           <w:rFonts w:ascii="Times New Roman" w:hAnsi="Times New Roman" w:cs="Times New Roman"/>
         </w:rPr>
       </w:pPr>
-      <w:bookmarkStart w:id="35" w:name="_Toc230534246"/>
+      <w:bookmarkStart w:id="36" w:name="_Toc230535065"/>
       <w:r>
         <w:rPr>
           <w:rFonts w:ascii="Times New Roman" w:hAnsi="Times New Roman" w:cs="Times New Roman"/>
         </w:rPr>
         <w:t>5.1. Key Findings</w:t>
       </w:r>
-      <w:bookmarkEnd w:id="35"/>
+      <w:bookmarkEnd w:id="36"/>
     </w:p>
     <w:p>
       <w:pPr>
@@ -14563,14 +14977,14 @@
           <w:rFonts w:ascii="Times New Roman" w:hAnsi="Times New Roman" w:cs="Times New Roman"/>
         </w:rPr>
       </w:pPr>
-      <w:bookmarkStart w:id="36" w:name="_Toc230534247"/>
+      <w:bookmarkStart w:id="37" w:name="_Toc230535066"/>
       <w:r>
         <w:rPr>
           <w:rFonts w:ascii="Times New Roman" w:hAnsi="Times New Roman" w:cs="Times New Roman"/>
         </w:rPr>
         <w:t>5.2. Limitations &amp; Future Directions</w:t>
       </w:r>
-      <w:bookmarkEnd w:id="36"/>
+      <w:bookmarkEnd w:id="37"/>
     </w:p>
     <w:p>
       <w:pPr>
@@ -14579,14 +14993,14 @@
           <w:rFonts w:ascii="Times New Roman" w:hAnsi="Times New Roman" w:cs="Times New Roman"/>
         </w:rPr>
       </w:pPr>
-      <w:bookmarkStart w:id="37" w:name="_Toc230534248"/>
+      <w:bookmarkStart w:id="38" w:name="_Toc230535067"/>
       <w:r>
         <w:rPr>
           <w:rFonts w:ascii="Times New Roman" w:hAnsi="Times New Roman" w:cs="Times New Roman"/>
         </w:rPr>
         <w:t>Hạn chế hiện tại</w:t>
       </w:r>
-      <w:bookmarkEnd w:id="37"/>
+      <w:bookmarkEnd w:id="38"/>
     </w:p>
     <w:p>
       <w:pPr>
@@ -14684,14 +15098,14 @@
           <w:rFonts w:ascii="Times New Roman" w:hAnsi="Times New Roman" w:cs="Times New Roman"/>
         </w:rPr>
       </w:pPr>
-      <w:bookmarkStart w:id="38" w:name="_Toc230534249"/>
+      <w:bookmarkStart w:id="39" w:name="_Toc230535068"/>
       <w:r>
         <w:rPr>
           <w:rFonts w:ascii="Times New Roman" w:hAnsi="Times New Roman" w:cs="Times New Roman"/>
         </w:rPr>
         <w:t>Hướng phát triển</w:t>
       </w:r>
-      <w:bookmarkEnd w:id="38"/>
+      <w:bookmarkEnd w:id="39"/>
     </w:p>
     <w:p>
       <w:pPr>
@@ -14820,7 +15234,7 @@
           <w:rFonts w:ascii="Times New Roman" w:hAnsi="Times New Roman" w:cs="Times New Roman"/>
         </w:rPr>
       </w:pPr>
-      <w:bookmarkStart w:id="39" w:name="_Toc230534250"/>
+      <w:bookmarkStart w:id="40" w:name="_Toc230535069"/>
       <w:r>
         <w:rPr>
           <w:rFonts w:ascii="Times New Roman" w:hAnsi="Times New Roman" w:cs="Times New Roman"/>
@@ -14828,7 +15242,7 @@
         <w:lastRenderedPageBreak/>
         <w:t>6. PHÂN CÔNG &amp; REPOSITORY</w:t>
       </w:r>
-      <w:bookmarkEnd w:id="39"/>
+      <w:bookmarkEnd w:id="40"/>
     </w:p>
     <w:p>
       <w:pPr>
@@ -14837,14 +15251,14 @@
           <w:rFonts w:ascii="Times New Roman" w:hAnsi="Times New Roman" w:cs="Times New Roman"/>
         </w:rPr>
       </w:pPr>
-      <w:bookmarkStart w:id="40" w:name="_Toc230534251"/>
+      <w:bookmarkStart w:id="41" w:name="_Toc230535070"/>
       <w:r>
         <w:rPr>
           <w:rFonts w:ascii="Times New Roman" w:hAnsi="Times New Roman" w:cs="Times New Roman"/>
         </w:rPr>
         <w:t>6.1. Distribution of Responsibilities</w:t>
       </w:r>
-      <w:bookmarkEnd w:id="40"/>
+      <w:bookmarkEnd w:id="41"/>
     </w:p>
     <w:tbl>
       <w:tblPr>
@@ -15754,14 +16168,14 @@
           <w:rFonts w:ascii="Times New Roman" w:hAnsi="Times New Roman" w:cs="Times New Roman"/>
         </w:rPr>
       </w:pPr>
-      <w:bookmarkStart w:id="41" w:name="_Toc230534252"/>
+      <w:bookmarkStart w:id="42" w:name="_Toc230535071"/>
       <w:r>
         <w:rPr>
           <w:rFonts w:ascii="Times New Roman" w:hAnsi="Times New Roman" w:cs="Times New Roman"/>
         </w:rPr>
         <w:t>6.2. Project Repository</w:t>
       </w:r>
-      <w:bookmarkEnd w:id="41"/>
+      <w:bookmarkEnd w:id="42"/>
     </w:p>
     <w:p>
       <w:pPr>
@@ -16307,14 +16721,14 @@
           <w:rFonts w:ascii="Times New Roman" w:hAnsi="Times New Roman" w:cs="Times New Roman"/>
         </w:rPr>
       </w:pPr>
-      <w:bookmarkStart w:id="42" w:name="_Toc230534253"/>
+      <w:bookmarkStart w:id="43" w:name="_Toc230535072"/>
       <w:r>
         <w:rPr>
           <w:rFonts w:ascii="Times New Roman" w:hAnsi="Times New Roman" w:cs="Times New Roman"/>
         </w:rPr>
         <w:t>7. TÀI LIỆU THAM KHẢO</w:t>
       </w:r>
-      <w:bookmarkEnd w:id="42"/>
+      <w:bookmarkEnd w:id="43"/>
     </w:p>
     <w:p>
       <w:pPr>
@@ -16864,6 +17278,119 @@
     </w:lvl>
   </w:abstractNum>
   <w:abstractNum w:abstractNumId="3" w15:restartNumberingAfterBreak="0">
+    <w:nsid w:val="294D1903"/>
+    <w:multiLevelType w:val="hybridMultilevel"/>
+    <w:tmpl w:val="BF940DC4"/>
+    <w:lvl w:ilvl="0" w:tplc="04090001">
+      <w:start w:val="1"/>
+      <w:numFmt w:val="bullet"/>
+      <w:lvlText w:val=""/>
+      <w:lvlJc w:val="left"/>
+      <w:pPr>
+        <w:ind w:left="720" w:hanging="360"/>
+      </w:pPr>
+      <w:rPr>
+        <w:rFonts w:ascii="Symbol" w:hAnsi="Symbol" w:hint="default"/>
+      </w:rPr>
+    </w:lvl>
+    <w:lvl w:ilvl="1" w:tplc="04090003" w:tentative="1">
+      <w:start w:val="1"/>
+      <w:numFmt w:val="bullet"/>
+      <w:lvlText w:val="o"/>
+      <w:lvlJc w:val="left"/>
+      <w:pPr>
+        <w:ind w:left="1440" w:hanging="360"/>
+      </w:pPr>
+      <w:rPr>
+        <w:rFonts w:ascii="Courier New" w:hAnsi="Courier New" w:cs="Courier New" w:hint="default"/>
+      </w:rPr>
+    </w:lvl>
+    <w:lvl w:ilvl="2" w:tplc="04090005" w:tentative="1">
+      <w:start w:val="1"/>
+      <w:numFmt w:val="bullet"/>
+      <w:lvlText w:val=""/>
+      <w:lvlJc w:val="left"/>
+      <w:pPr>
+        <w:ind w:left="2160" w:hanging="360"/>
+      </w:pPr>
+      <w:rPr>
+        <w:rFonts w:ascii="Wingdings" w:hAnsi="Wingdings" w:hint="default"/>
+      </w:rPr>
+    </w:lvl>
+    <w:lvl w:ilvl="3" w:tplc="04090001" w:tentative="1">
+      <w:start w:val="1"/>
+      <w:numFmt w:val="bullet"/>
+      <w:lvlText w:val=""/>
+      <w:lvlJc w:val="left"/>
+      <w:pPr>
+        <w:ind w:left="2880" w:hanging="360"/>
+      </w:pPr>
+      <w:rPr>
+        <w:rFonts w:ascii="Symbol" w:hAnsi="Symbol" w:hint="default"/>
+      </w:rPr>
+    </w:lvl>
+    <w:lvl w:ilvl="4" w:tplc="04090003" w:tentative="1">
+      <w:start w:val="1"/>
+      <w:numFmt w:val="bullet"/>
+      <w:lvlText w:val="o"/>
+      <w:lvlJc w:val="left"/>
+      <w:pPr>
+        <w:ind w:left="3600" w:hanging="360"/>
+      </w:pPr>
+      <w:rPr>
+        <w:rFonts w:ascii="Courier New" w:hAnsi="Courier New" w:cs="Courier New" w:hint="default"/>
+      </w:rPr>
+    </w:lvl>
+    <w:lvl w:ilvl="5" w:tplc="04090005" w:tentative="1">
+      <w:start w:val="1"/>
+      <w:numFmt w:val="bullet"/>
+      <w:lvlText w:val=""/>
+      <w:lvlJc w:val="left"/>
+      <w:pPr>
+        <w:ind w:left="4320" w:hanging="360"/>
+      </w:pPr>
+      <w:rPr>
+        <w:rFonts w:ascii="Wingdings" w:hAnsi="Wingdings" w:hint="default"/>
+      </w:rPr>
+    </w:lvl>
+    <w:lvl w:ilvl="6" w:tplc="04090001" w:tentative="1">
+      <w:start w:val="1"/>
+      <w:numFmt w:val="bullet"/>
+      <w:lvlText w:val=""/>
+      <w:lvlJc w:val="left"/>
+      <w:pPr>
+        <w:ind w:left="5040" w:hanging="360"/>
+      </w:pPr>
+      <w:rPr>
+        <w:rFonts w:ascii="Symbol" w:hAnsi="Symbol" w:hint="default"/>
+      </w:rPr>
+    </w:lvl>
+    <w:lvl w:ilvl="7" w:tplc="04090003" w:tentative="1">
+      <w:start w:val="1"/>
+      <w:numFmt w:val="bullet"/>
+      <w:lvlText w:val="o"/>
+      <w:lvlJc w:val="left"/>
+      <w:pPr>
+        <w:ind w:left="5760" w:hanging="360"/>
+      </w:pPr>
+      <w:rPr>
+        <w:rFonts w:ascii="Courier New" w:hAnsi="Courier New" w:cs="Courier New" w:hint="default"/>
+      </w:rPr>
+    </w:lvl>
+    <w:lvl w:ilvl="8" w:tplc="04090005" w:tentative="1">
+      <w:start w:val="1"/>
+      <w:numFmt w:val="bullet"/>
+      <w:lvlText w:val=""/>
+      <w:lvlJc w:val="left"/>
+      <w:pPr>
+        <w:ind w:left="6480" w:hanging="360"/>
+      </w:pPr>
+      <w:rPr>
+        <w:rFonts w:ascii="Wingdings" w:hAnsi="Wingdings" w:hint="default"/>
+      </w:rPr>
+    </w:lvl>
+  </w:abstractNum>
+  <w:abstractNum w:abstractNumId="4" w15:restartNumberingAfterBreak="0">
     <w:nsid w:val="40F537E2"/>
     <w:multiLevelType w:val="hybridMultilevel"/>
     <w:tmpl w:val="282A43DC"/>
@@ -16917,7 +17444,7 @@
       <w:lvlJc w:val="left"/>
     </w:lvl>
   </w:abstractNum>
-  <w:abstractNum w:abstractNumId="4" w15:restartNumberingAfterBreak="0">
+  <w:abstractNum w:abstractNumId="5" w15:restartNumberingAfterBreak="0">
     <w:nsid w:val="46987E8F"/>
     <w:multiLevelType w:val="hybridMultilevel"/>
     <w:tmpl w:val="0ABE9776"/>
@@ -16971,7 +17498,7 @@
       <w:lvlJc w:val="left"/>
     </w:lvl>
   </w:abstractNum>
-  <w:abstractNum w:abstractNumId="5" w15:restartNumberingAfterBreak="0">
+  <w:abstractNum w:abstractNumId="6" w15:restartNumberingAfterBreak="0">
     <w:nsid w:val="5BB20AAF"/>
     <w:multiLevelType w:val="hybridMultilevel"/>
     <w:tmpl w:val="1BD06458"/>
@@ -17025,7 +17552,7 @@
       <w:lvlJc w:val="left"/>
     </w:lvl>
   </w:abstractNum>
-  <w:abstractNum w:abstractNumId="6" w15:restartNumberingAfterBreak="0">
+  <w:abstractNum w:abstractNumId="7" w15:restartNumberingAfterBreak="0">
     <w:nsid w:val="6ACF5977"/>
     <w:multiLevelType w:val="hybridMultilevel"/>
     <w:tmpl w:val="0C324A0C"/>
@@ -17079,7 +17606,7 @@
       <w:lvlJc w:val="left"/>
     </w:lvl>
   </w:abstractNum>
-  <w:abstractNum w:abstractNumId="7" w15:restartNumberingAfterBreak="0">
+  <w:abstractNum w:abstractNumId="8" w15:restartNumberingAfterBreak="0">
     <w:nsid w:val="70257C0B"/>
     <w:multiLevelType w:val="hybridMultilevel"/>
     <w:tmpl w:val="F6A48A80"/>
@@ -17133,7 +17660,7 @@
       <w:lvlJc w:val="left"/>
     </w:lvl>
   </w:abstractNum>
-  <w:abstractNum w:abstractNumId="8" w15:restartNumberingAfterBreak="0">
+  <w:abstractNum w:abstractNumId="9" w15:restartNumberingAfterBreak="0">
     <w:nsid w:val="7B9C5BFE"/>
     <w:multiLevelType w:val="hybridMultilevel"/>
     <w:tmpl w:val="BFA24560"/>
@@ -17194,19 +17721,19 @@
     </w:lvlOverride>
   </w:num>
   <w:num w:numId="2" w16cid:durableId="866990715">
-    <w:abstractNumId w:val="4"/>
+    <w:abstractNumId w:val="5"/>
     <w:lvlOverride w:ilvl="0">
       <w:startOverride w:val="1"/>
     </w:lvlOverride>
   </w:num>
   <w:num w:numId="3" w16cid:durableId="1233614684">
-    <w:abstractNumId w:val="8"/>
+    <w:abstractNumId w:val="9"/>
     <w:lvlOverride w:ilvl="0">
       <w:startOverride w:val="1"/>
     </w:lvlOverride>
   </w:num>
   <w:num w:numId="4" w16cid:durableId="363019921">
-    <w:abstractNumId w:val="6"/>
+    <w:abstractNumId w:val="7"/>
     <w:lvlOverride w:ilvl="0">
       <w:startOverride w:val="1"/>
     </w:lvlOverride>
@@ -17218,19 +17745,22 @@
     </w:lvlOverride>
   </w:num>
   <w:num w:numId="6" w16cid:durableId="1267078371">
-    <w:abstractNumId w:val="5"/>
+    <w:abstractNumId w:val="6"/>
     <w:lvlOverride w:ilvl="0">
       <w:startOverride w:val="1"/>
     </w:lvlOverride>
   </w:num>
   <w:num w:numId="7" w16cid:durableId="1033767724">
-    <w:abstractNumId w:val="7"/>
+    <w:abstractNumId w:val="8"/>
     <w:lvlOverride w:ilvl="0">
       <w:startOverride w:val="1"/>
     </w:lvlOverride>
   </w:num>
   <w:num w:numId="8" w16cid:durableId="27923513">
     <w:abstractNumId w:val="0"/>
+  </w:num>
+  <w:num w:numId="9" w16cid:durableId="2107919565">
+    <w:abstractNumId w:val="3"/>
   </w:num>
 </w:numbering>
 </file>
@@ -17724,7 +18254,6 @@
   <w:style w:type="character" w:default="1" w:styleId="DefaultParagraphFont">
     <w:name w:val="Default Paragraph Font"/>
     <w:uiPriority w:val="1"/>
-    <w:semiHidden/>
     <w:unhideWhenUsed/>
   </w:style>
   <w:style w:type="table" w:default="1" w:styleId="TableNormal">

</xml_diff>